<commit_message>
Add Kseniia time log
</commit_message>
<xml_diff>
--- a/docs/Time Log Kseniia.docx
+++ b/docs/Time Log Kseniia.docx
@@ -2,7 +2,7 @@
 <file path=word/document.xml><?xml version="1.0" encoding="utf-8"?>
 <w:document xmlns:wpc="http://schemas.microsoft.com/office/word/2010/wordprocessingCanvas" xmlns:mc="http://schemas.openxmlformats.org/markup-compatibility/2006" xmlns:o="urn:schemas-microsoft-com:office:office" xmlns:r="http://schemas.openxmlformats.org/officeDocument/2006/relationships" xmlns:m="http://schemas.openxmlformats.org/officeDocument/2006/math" xmlns:v="urn:schemas-microsoft-com:vml" xmlns:wp14="http://schemas.microsoft.com/office/word/2010/wordprocessingDrawing" xmlns:wp="http://schemas.openxmlformats.org/drawingml/2006/wordprocessingDrawing" xmlns:w10="urn:schemas-microsoft-com:office:word" xmlns:w="http://schemas.openxmlformats.org/wordprocessingml/2006/main" xmlns:w14="http://schemas.microsoft.com/office/word/2010/wordml" xmlns:w15="http://schemas.microsoft.com/office/word/2012/wordml" xmlns:wpg="http://schemas.microsoft.com/office/word/2010/wordprocessingGroup" xmlns:wpi="http://schemas.microsoft.com/office/word/2010/wordprocessingInk" xmlns:wne="http://schemas.microsoft.com/office/word/2006/wordml" xmlns:wps="http://schemas.microsoft.com/office/word/2010/wordprocessingShape" xmlns:w16se="http://schemas.microsoft.com/office/word/2015/wordml/symex" xmlns:w16cid="http://schemas.microsoft.com/office/word/2016/wordml/cid" xmlns:w16="http://schemas.microsoft.com/office/word/2018/wordml" xmlns:w16cex="http://schemas.microsoft.com/office/word/2018/wordml/cex" xmlns:w16sdtdh="http://schemas.microsoft.com/office/word/2020/wordml/sdtdatahash" xmlns:w16sdtfl="http://schemas.microsoft.com/office/word/2024/wordml/sdtformatlock" mc:Ignorable="w14 w15 wp14 w16se w16cid w16 w16cex w16sdtdh w16sdtfl">
   <w:body>
-    <w:p xmlns:wp14="http://schemas.microsoft.com/office/word/2010/wordml" wp14:paraId="5D4FAAC7" wp14:textId="2A222798">
+    <w:p xmlns:wp14="http://schemas.microsoft.com/office/word/2010/wordml" wp14:paraId="55A83785" wp14:textId="73DF48A8">
       <w:pPr>
         <w:spacing w:before="0" w:beforeAutospacing="off" w:after="150" w:afterAutospacing="off"/>
         <w:jc w:val="center"/>
@@ -20,7 +20,7 @@
           <w:szCs w:val="16"/>
           <w:lang w:val="en-US"/>
         </w:rPr>
-        <w:t>Time Log</w:t>
+        <w:t>Peer Evaluation</w:t>
       </w:r>
     </w:p>
     <w:p xmlns:wp14="http://schemas.microsoft.com/office/word/2010/wordml" wp14:paraId="4E45269C" wp14:textId="4EFC52B3">
@@ -336,7 +336,22 @@
           </w:tcPr>
           <w:p>
             <w:pPr>
-              <w:spacing w:before="0" w:beforeAutospacing="off" w:after="0" w:afterAutospacing="off"/>
+              <w:pStyle w:val="Normal"/>
+              <w:suppressLineNumbers w:val="0"/>
+              <w:bidi w:val="0"/>
+              <w:spacing w:before="0" w:beforeAutospacing="off" w:after="150" w:afterAutospacing="off" w:line="279" w:lineRule="auto"/>
+              <w:ind w:left="0" w:right="0"/>
+              <w:jc w:val="center"/>
+              <w:rPr>
+                <w:rFonts w:ascii="Helvetica" w:hAnsi="Helvetica" w:eastAsia="Helvetica" w:cs="Helvetica"/>
+                <w:b w:val="0"/>
+                <w:bCs w:val="0"/>
+                <w:i w:val="0"/>
+                <w:iCs w:val="0"/>
+                <w:color w:val="000000" w:themeColor="text1" w:themeTint="FF" w:themeShade="FF"/>
+                <w:sz w:val="16"/>
+                <w:szCs w:val="16"/>
+              </w:rPr>
             </w:pPr>
             <w:r>
               <w:rPr>
@@ -354,7 +369,22 @@
           </w:p>
           <w:p>
             <w:pPr>
-              <w:spacing w:before="0" w:beforeAutospacing="off" w:after="0" w:afterAutospacing="off"/>
+              <w:pStyle w:val="Normal"/>
+              <w:suppressLineNumbers w:val="0"/>
+              <w:bidi w:val="0"/>
+              <w:spacing w:before="0" w:beforeAutospacing="off" w:after="150" w:afterAutospacing="off" w:line="279" w:lineRule="auto"/>
+              <w:ind w:left="0" w:right="0"/>
+              <w:jc w:val="center"/>
+              <w:rPr>
+                <w:rFonts w:ascii="Helvetica" w:hAnsi="Helvetica" w:eastAsia="Helvetica" w:cs="Helvetica"/>
+                <w:b w:val="0"/>
+                <w:bCs w:val="0"/>
+                <w:i w:val="0"/>
+                <w:iCs w:val="0"/>
+                <w:color w:val="000000" w:themeColor="text1" w:themeTint="FF" w:themeShade="FF"/>
+                <w:sz w:val="16"/>
+                <w:szCs w:val="16"/>
+              </w:rPr>
             </w:pPr>
             <w:r>
               <w:rPr>
@@ -390,7 +420,22 @@
           </w:tcPr>
           <w:p>
             <w:pPr>
-              <w:spacing w:before="0" w:beforeAutospacing="off" w:after="0" w:afterAutospacing="off"/>
+              <w:pStyle w:val="Normal"/>
+              <w:suppressLineNumbers w:val="0"/>
+              <w:bidi w:val="0"/>
+              <w:spacing w:before="0" w:beforeAutospacing="off" w:after="150" w:afterAutospacing="off" w:line="279" w:lineRule="auto"/>
+              <w:ind w:left="0" w:right="0"/>
+              <w:jc w:val="center"/>
+              <w:rPr>
+                <w:rFonts w:ascii="Helvetica" w:hAnsi="Helvetica" w:eastAsia="Helvetica" w:cs="Helvetica"/>
+                <w:b w:val="0"/>
+                <w:bCs w:val="0"/>
+                <w:i w:val="0"/>
+                <w:iCs w:val="0"/>
+                <w:color w:val="000000" w:themeColor="text1" w:themeTint="FF" w:themeShade="FF"/>
+                <w:sz w:val="16"/>
+                <w:szCs w:val="16"/>
+              </w:rPr>
             </w:pPr>
             <w:r>
               <w:rPr>
@@ -426,7 +471,22 @@
           </w:tcPr>
           <w:p>
             <w:pPr>
-              <w:spacing w:before="0" w:beforeAutospacing="off" w:after="0" w:afterAutospacing="off"/>
+              <w:pStyle w:val="Normal"/>
+              <w:suppressLineNumbers w:val="0"/>
+              <w:bidi w:val="0"/>
+              <w:spacing w:before="0" w:beforeAutospacing="off" w:after="150" w:afterAutospacing="off" w:line="279" w:lineRule="auto"/>
+              <w:ind w:left="0" w:right="0"/>
+              <w:jc w:val="center"/>
+              <w:rPr>
+                <w:rFonts w:ascii="Helvetica" w:hAnsi="Helvetica" w:eastAsia="Helvetica" w:cs="Helvetica"/>
+                <w:b w:val="0"/>
+                <w:bCs w:val="0"/>
+                <w:i w:val="0"/>
+                <w:iCs w:val="0"/>
+                <w:color w:val="000000" w:themeColor="text1" w:themeTint="FF" w:themeShade="FF"/>
+                <w:sz w:val="16"/>
+                <w:szCs w:val="16"/>
+              </w:rPr>
             </w:pPr>
             <w:r>
               <w:rPr>
@@ -462,7 +522,22 @@
           </w:tcPr>
           <w:p>
             <w:pPr>
-              <w:spacing w:before="0" w:beforeAutospacing="off" w:after="0" w:afterAutospacing="off"/>
+              <w:pStyle w:val="Normal"/>
+              <w:suppressLineNumbers w:val="0"/>
+              <w:bidi w:val="0"/>
+              <w:spacing w:before="0" w:beforeAutospacing="off" w:after="150" w:afterAutospacing="off" w:line="279" w:lineRule="auto"/>
+              <w:ind w:left="0" w:right="0"/>
+              <w:jc w:val="center"/>
+              <w:rPr>
+                <w:rFonts w:ascii="Helvetica" w:hAnsi="Helvetica" w:eastAsia="Helvetica" w:cs="Helvetica"/>
+                <w:b w:val="0"/>
+                <w:bCs w:val="0"/>
+                <w:i w:val="0"/>
+                <w:iCs w:val="0"/>
+                <w:color w:val="000000" w:themeColor="text1" w:themeTint="FF" w:themeShade="FF"/>
+                <w:sz w:val="16"/>
+                <w:szCs w:val="16"/>
+              </w:rPr>
             </w:pPr>
             <w:r>
               <w:rPr>
@@ -524,7 +599,22 @@
           </w:tcPr>
           <w:p>
             <w:pPr>
-              <w:spacing w:before="0" w:beforeAutospacing="off" w:after="0" w:afterAutospacing="off"/>
+              <w:pStyle w:val="Normal"/>
+              <w:suppressLineNumbers w:val="0"/>
+              <w:bidi w:val="0"/>
+              <w:spacing w:before="0" w:beforeAutospacing="off" w:after="150" w:afterAutospacing="off" w:line="279" w:lineRule="auto"/>
+              <w:ind w:left="0" w:right="0"/>
+              <w:jc w:val="center"/>
+              <w:rPr>
+                <w:rFonts w:ascii="Helvetica" w:hAnsi="Helvetica" w:eastAsia="Helvetica" w:cs="Helvetica"/>
+                <w:b w:val="0"/>
+                <w:bCs w:val="0"/>
+                <w:i w:val="0"/>
+                <w:iCs w:val="0"/>
+                <w:color w:val="000000" w:themeColor="text1" w:themeTint="FF" w:themeShade="FF"/>
+                <w:sz w:val="16"/>
+                <w:szCs w:val="16"/>
+              </w:rPr>
             </w:pPr>
             <w:r>
               <w:rPr>
@@ -586,7 +676,22 @@
           </w:tcPr>
           <w:p>
             <w:pPr>
-              <w:spacing w:before="0" w:beforeAutospacing="off" w:after="0" w:afterAutospacing="off"/>
+              <w:pStyle w:val="Normal"/>
+              <w:suppressLineNumbers w:val="0"/>
+              <w:bidi w:val="0"/>
+              <w:spacing w:before="0" w:beforeAutospacing="off" w:after="150" w:afterAutospacing="off" w:line="279" w:lineRule="auto"/>
+              <w:ind w:left="0" w:right="0"/>
+              <w:jc w:val="center"/>
+              <w:rPr>
+                <w:rFonts w:ascii="Helvetica" w:hAnsi="Helvetica" w:eastAsia="Helvetica" w:cs="Helvetica"/>
+                <w:b w:val="0"/>
+                <w:bCs w:val="0"/>
+                <w:i w:val="0"/>
+                <w:iCs w:val="0"/>
+                <w:color w:val="000000" w:themeColor="text1" w:themeTint="FF" w:themeShade="FF"/>
+                <w:sz w:val="16"/>
+                <w:szCs w:val="16"/>
+              </w:rPr>
             </w:pPr>
             <w:r>
               <w:rPr>
@@ -627,7 +732,22 @@
           </w:tcPr>
           <w:p>
             <w:pPr>
-              <w:spacing w:before="0" w:beforeAutospacing="off" w:after="0" w:afterAutospacing="off"/>
+              <w:pStyle w:val="Normal"/>
+              <w:suppressLineNumbers w:val="0"/>
+              <w:bidi w:val="0"/>
+              <w:spacing w:before="0" w:beforeAutospacing="off" w:after="150" w:afterAutospacing="off" w:line="279" w:lineRule="auto"/>
+              <w:ind w:left="0" w:right="0"/>
+              <w:jc w:val="center"/>
+              <w:rPr>
+                <w:rFonts w:ascii="Helvetica" w:hAnsi="Helvetica" w:eastAsia="Helvetica" w:cs="Helvetica"/>
+                <w:b w:val="0"/>
+                <w:bCs w:val="0"/>
+                <w:i w:val="0"/>
+                <w:iCs w:val="0"/>
+                <w:color w:val="000000" w:themeColor="text1" w:themeTint="FF" w:themeShade="FF"/>
+                <w:sz w:val="16"/>
+                <w:szCs w:val="16"/>
+              </w:rPr>
             </w:pPr>
           </w:p>
         </w:tc>
@@ -651,16 +771,37 @@
           <w:p>
             <w:pPr>
               <w:pStyle w:val="Normal"/>
-              <w:spacing w:before="0" w:beforeAutospacing="off" w:after="0" w:afterAutospacing="off"/>
-            </w:pPr>
-            <w:r>
-              <w:rPr>
-                <w:rFonts w:ascii="Helvetica" w:hAnsi="Helvetica" w:eastAsia="Helvetica" w:cs="Helvetica"/>
+              <w:suppressLineNumbers w:val="0"/>
+              <w:bidi w:val="0"/>
+              <w:spacing w:before="0" w:beforeAutospacing="off" w:after="150" w:afterAutospacing="off" w:line="279" w:lineRule="auto"/>
+              <w:ind w:left="0" w:right="0"/>
+              <w:jc w:val="center"/>
+              <w:rPr>
+                <w:rFonts w:ascii="Helvetica" w:hAnsi="Helvetica" w:eastAsia="Helvetica" w:cs="Helvetica"/>
+                <w:b w:val="0"/>
+                <w:bCs w:val="0"/>
+                <w:i w:val="0"/>
+                <w:iCs w:val="0"/>
                 <w:noProof w:val="0"/>
+                <w:color w:val="000000" w:themeColor="text1" w:themeTint="FF" w:themeShade="FF"/>
                 <w:sz w:val="16"/>
                 <w:szCs w:val="16"/>
                 <w:lang w:val="en-US"/>
               </w:rPr>
+            </w:pPr>
+            <w:r>
+              <w:rPr>
+                <w:rFonts w:ascii="Helvetica" w:hAnsi="Helvetica" w:eastAsia="Helvetica" w:cs="Helvetica"/>
+                <w:b w:val="0"/>
+                <w:bCs w:val="0"/>
+                <w:i w:val="0"/>
+                <w:iCs w:val="0"/>
+                <w:noProof w:val="0"/>
+                <w:color w:val="000000" w:themeColor="text1" w:themeTint="FF" w:themeShade="FF"/>
+                <w:sz w:val="16"/>
+                <w:szCs w:val="16"/>
+                <w:lang w:val="en-US"/>
+              </w:rPr>
               <w:t>Creating LMS UI mockup in Moqups</w:t>
             </w:r>
           </w:p>
@@ -684,7 +825,22 @@
           </w:tcPr>
           <w:p>
             <w:pPr>
-              <w:spacing w:before="0" w:beforeAutospacing="off" w:after="0" w:afterAutospacing="off"/>
+              <w:pStyle w:val="Normal"/>
+              <w:suppressLineNumbers w:val="0"/>
+              <w:bidi w:val="0"/>
+              <w:spacing w:before="0" w:beforeAutospacing="off" w:after="150" w:afterAutospacing="off" w:line="279" w:lineRule="auto"/>
+              <w:ind w:left="0" w:right="0"/>
+              <w:jc w:val="center"/>
+              <w:rPr>
+                <w:rFonts w:ascii="Helvetica" w:hAnsi="Helvetica" w:eastAsia="Helvetica" w:cs="Helvetica"/>
+                <w:b w:val="0"/>
+                <w:bCs w:val="0"/>
+                <w:i w:val="0"/>
+                <w:iCs w:val="0"/>
+                <w:color w:val="000000" w:themeColor="text1" w:themeTint="FF" w:themeShade="FF"/>
+                <w:sz w:val="16"/>
+                <w:szCs w:val="16"/>
+              </w:rPr>
             </w:pPr>
             <w:r>
               <w:rPr>
@@ -746,7 +902,22 @@
           </w:tcPr>
           <w:p>
             <w:pPr>
-              <w:spacing w:before="0" w:beforeAutospacing="off" w:after="0" w:afterAutospacing="off"/>
+              <w:pStyle w:val="Normal"/>
+              <w:suppressLineNumbers w:val="0"/>
+              <w:bidi w:val="0"/>
+              <w:spacing w:before="0" w:beforeAutospacing="off" w:after="150" w:afterAutospacing="off" w:line="279" w:lineRule="auto"/>
+              <w:ind w:left="0" w:right="0"/>
+              <w:jc w:val="center"/>
+              <w:rPr>
+                <w:rFonts w:ascii="Helvetica" w:hAnsi="Helvetica" w:eastAsia="Helvetica" w:cs="Helvetica"/>
+                <w:b w:val="0"/>
+                <w:bCs w:val="0"/>
+                <w:i w:val="0"/>
+                <w:iCs w:val="0"/>
+                <w:color w:val="000000" w:themeColor="text1" w:themeTint="FF" w:themeShade="FF"/>
+                <w:sz w:val="16"/>
+                <w:szCs w:val="16"/>
+              </w:rPr>
             </w:pPr>
             <w:r>
               <w:rPr>
@@ -847,7 +1018,22 @@
           </w:tcPr>
           <w:p>
             <w:pPr>
-              <w:spacing w:before="0" w:beforeAutospacing="off" w:after="0" w:afterAutospacing="off"/>
+              <w:pStyle w:val="Normal"/>
+              <w:suppressLineNumbers w:val="0"/>
+              <w:bidi w:val="0"/>
+              <w:spacing w:before="0" w:beforeAutospacing="off" w:after="150" w:afterAutospacing="off" w:line="279" w:lineRule="auto"/>
+              <w:ind w:left="0" w:right="0"/>
+              <w:jc w:val="center"/>
+              <w:rPr>
+                <w:rFonts w:ascii="Helvetica" w:hAnsi="Helvetica" w:eastAsia="Helvetica" w:cs="Helvetica"/>
+                <w:b w:val="0"/>
+                <w:bCs w:val="0"/>
+                <w:i w:val="0"/>
+                <w:iCs w:val="0"/>
+                <w:color w:val="000000" w:themeColor="text1" w:themeTint="FF" w:themeShade="FF"/>
+                <w:sz w:val="16"/>
+                <w:szCs w:val="16"/>
+              </w:rPr>
             </w:pPr>
             <w:r>
               <w:rPr>
@@ -948,7 +1134,22 @@
           </w:tcPr>
           <w:p>
             <w:pPr>
-              <w:spacing w:before="0" w:beforeAutospacing="off" w:after="0" w:afterAutospacing="off"/>
+              <w:pStyle w:val="Normal"/>
+              <w:suppressLineNumbers w:val="0"/>
+              <w:bidi w:val="0"/>
+              <w:spacing w:before="0" w:beforeAutospacing="off" w:after="150" w:afterAutospacing="off" w:line="279" w:lineRule="auto"/>
+              <w:ind w:left="0" w:right="0"/>
+              <w:jc w:val="center"/>
+              <w:rPr>
+                <w:rFonts w:ascii="Helvetica" w:hAnsi="Helvetica" w:eastAsia="Helvetica" w:cs="Helvetica"/>
+                <w:b w:val="0"/>
+                <w:bCs w:val="0"/>
+                <w:i w:val="0"/>
+                <w:iCs w:val="0"/>
+                <w:color w:val="000000" w:themeColor="text1" w:themeTint="FF" w:themeShade="FF"/>
+                <w:sz w:val="16"/>
+                <w:szCs w:val="16"/>
+              </w:rPr>
             </w:pPr>
             <w:r>
               <w:rPr>
@@ -1002,7 +1203,22 @@
           </w:tcPr>
           <w:p>
             <w:pPr>
-              <w:spacing w:before="0" w:beforeAutospacing="off" w:after="0" w:afterAutospacing="off"/>
+              <w:pStyle w:val="Normal"/>
+              <w:suppressLineNumbers w:val="0"/>
+              <w:bidi w:val="0"/>
+              <w:spacing w:before="0" w:beforeAutospacing="off" w:after="150" w:afterAutospacing="off" w:line="279" w:lineRule="auto"/>
+              <w:ind w:left="0" w:right="0"/>
+              <w:jc w:val="center"/>
+              <w:rPr>
+                <w:rFonts w:ascii="Helvetica" w:hAnsi="Helvetica" w:eastAsia="Helvetica" w:cs="Helvetica"/>
+                <w:b w:val="0"/>
+                <w:bCs w:val="0"/>
+                <w:i w:val="0"/>
+                <w:iCs w:val="0"/>
+                <w:color w:val="000000" w:themeColor="text1" w:themeTint="FF" w:themeShade="FF"/>
+                <w:sz w:val="16"/>
+                <w:szCs w:val="16"/>
+              </w:rPr>
             </w:pPr>
           </w:p>
         </w:tc>
@@ -1025,7 +1241,22 @@
           </w:tcPr>
           <w:p>
             <w:pPr>
-              <w:spacing w:before="0" w:beforeAutospacing="off" w:after="0" w:afterAutospacing="off"/>
+              <w:pStyle w:val="Normal"/>
+              <w:suppressLineNumbers w:val="0"/>
+              <w:bidi w:val="0"/>
+              <w:spacing w:before="0" w:beforeAutospacing="off" w:after="150" w:afterAutospacing="off" w:line="279" w:lineRule="auto"/>
+              <w:ind w:left="0" w:right="0"/>
+              <w:jc w:val="center"/>
+              <w:rPr>
+                <w:rFonts w:ascii="Helvetica" w:hAnsi="Helvetica" w:eastAsia="Helvetica" w:cs="Helvetica"/>
+                <w:b w:val="0"/>
+                <w:bCs w:val="0"/>
+                <w:i w:val="0"/>
+                <w:iCs w:val="0"/>
+                <w:color w:val="000000" w:themeColor="text1" w:themeTint="FF" w:themeShade="FF"/>
+                <w:sz w:val="16"/>
+                <w:szCs w:val="16"/>
+              </w:rPr>
             </w:pPr>
             <w:r>
               <w:rPr>
@@ -1061,7 +1292,22 @@
           </w:tcPr>
           <w:p>
             <w:pPr>
-              <w:spacing w:before="0" w:beforeAutospacing="off" w:after="0" w:afterAutospacing="off"/>
+              <w:pStyle w:val="Normal"/>
+              <w:suppressLineNumbers w:val="0"/>
+              <w:bidi w:val="0"/>
+              <w:spacing w:before="0" w:beforeAutospacing="off" w:after="150" w:afterAutospacing="off" w:line="279" w:lineRule="auto"/>
+              <w:ind w:left="0" w:right="0"/>
+              <w:jc w:val="center"/>
+              <w:rPr>
+                <w:rFonts w:ascii="Helvetica" w:hAnsi="Helvetica" w:eastAsia="Helvetica" w:cs="Helvetica"/>
+                <w:b w:val="0"/>
+                <w:bCs w:val="0"/>
+                <w:i w:val="0"/>
+                <w:iCs w:val="0"/>
+                <w:color w:val="000000" w:themeColor="text1" w:themeTint="FF" w:themeShade="FF"/>
+                <w:sz w:val="16"/>
+                <w:szCs w:val="16"/>
+              </w:rPr>
             </w:pPr>
             <w:r>
               <w:rPr>
@@ -1079,7 +1325,12 @@
           </w:p>
           <w:p>
             <w:pPr>
-              <w:spacing w:before="0" w:beforeAutospacing="off" w:after="0" w:afterAutospacing="off"/>
+              <w:pStyle w:val="Normal"/>
+              <w:suppressLineNumbers w:val="0"/>
+              <w:bidi w:val="0"/>
+              <w:spacing w:before="0" w:beforeAutospacing="off" w:after="150" w:afterAutospacing="off" w:line="279" w:lineRule="auto"/>
+              <w:ind w:left="0" w:right="0"/>
+              <w:jc w:val="center"/>
               <w:rPr>
                 <w:rFonts w:ascii="Helvetica" w:hAnsi="Helvetica" w:eastAsia="Helvetica" w:cs="Helvetica"/>
                 <w:b w:val="0"/>
@@ -1112,7 +1363,22 @@
           </w:tcPr>
           <w:p>
             <w:pPr>
-              <w:spacing w:before="0" w:beforeAutospacing="off" w:after="0" w:afterAutospacing="off"/>
+              <w:pStyle w:val="Normal"/>
+              <w:suppressLineNumbers w:val="0"/>
+              <w:bidi w:val="0"/>
+              <w:spacing w:before="0" w:beforeAutospacing="off" w:after="150" w:afterAutospacing="off" w:line="279" w:lineRule="auto"/>
+              <w:ind w:left="0" w:right="0"/>
+              <w:jc w:val="center"/>
+              <w:rPr>
+                <w:rFonts w:ascii="Helvetica" w:hAnsi="Helvetica" w:eastAsia="Helvetica" w:cs="Helvetica"/>
+                <w:b w:val="0"/>
+                <w:bCs w:val="0"/>
+                <w:i w:val="0"/>
+                <w:iCs w:val="0"/>
+                <w:color w:val="000000" w:themeColor="text1" w:themeTint="FF" w:themeShade="FF"/>
+                <w:sz w:val="16"/>
+                <w:szCs w:val="16"/>
+              </w:rPr>
             </w:pPr>
             <w:r>
               <w:rPr>
@@ -1161,7 +1427,22 @@
           </w:tcPr>
           <w:p>
             <w:pPr>
-              <w:spacing w:before="0" w:beforeAutospacing="off" w:after="0" w:afterAutospacing="off"/>
+              <w:pStyle w:val="Normal"/>
+              <w:suppressLineNumbers w:val="0"/>
+              <w:bidi w:val="0"/>
+              <w:spacing w:before="0" w:beforeAutospacing="off" w:after="150" w:afterAutospacing="off" w:line="279" w:lineRule="auto"/>
+              <w:ind w:left="0" w:right="0"/>
+              <w:jc w:val="center"/>
+              <w:rPr>
+                <w:rFonts w:ascii="Helvetica" w:hAnsi="Helvetica" w:eastAsia="Helvetica" w:cs="Helvetica"/>
+                <w:b w:val="0"/>
+                <w:bCs w:val="0"/>
+                <w:i w:val="0"/>
+                <w:iCs w:val="0"/>
+                <w:color w:val="000000" w:themeColor="text1" w:themeTint="FF" w:themeShade="FF"/>
+                <w:sz w:val="16"/>
+                <w:szCs w:val="16"/>
+              </w:rPr>
             </w:pPr>
             <w:r>
               <w:rPr>
@@ -1236,7 +1517,22 @@
           </w:tcPr>
           <w:p>
             <w:pPr>
-              <w:spacing w:before="0" w:beforeAutospacing="off" w:after="0" w:afterAutospacing="off"/>
+              <w:pStyle w:val="Normal"/>
+              <w:suppressLineNumbers w:val="0"/>
+              <w:bidi w:val="0"/>
+              <w:spacing w:before="0" w:beforeAutospacing="off" w:after="150" w:afterAutospacing="off" w:line="279" w:lineRule="auto"/>
+              <w:ind w:left="0" w:right="0"/>
+              <w:jc w:val="center"/>
+              <w:rPr>
+                <w:rFonts w:ascii="Helvetica" w:hAnsi="Helvetica" w:eastAsia="Helvetica" w:cs="Helvetica"/>
+                <w:b w:val="0"/>
+                <w:bCs w:val="0"/>
+                <w:i w:val="0"/>
+                <w:iCs w:val="0"/>
+                <w:color w:val="000000" w:themeColor="text1" w:themeTint="FF" w:themeShade="FF"/>
+                <w:sz w:val="16"/>
+                <w:szCs w:val="16"/>
+              </w:rPr>
             </w:pPr>
             <w:r>
               <w:rPr>
@@ -1277,7 +1573,22 @@
           </w:tcPr>
           <w:p>
             <w:pPr>
-              <w:spacing w:before="0" w:beforeAutospacing="off" w:after="0" w:afterAutospacing="off"/>
+              <w:pStyle w:val="Normal"/>
+              <w:suppressLineNumbers w:val="0"/>
+              <w:bidi w:val="0"/>
+              <w:spacing w:before="0" w:beforeAutospacing="off" w:after="150" w:afterAutospacing="off" w:line="279" w:lineRule="auto"/>
+              <w:ind w:left="0" w:right="0"/>
+              <w:jc w:val="center"/>
+              <w:rPr>
+                <w:rFonts w:ascii="Helvetica" w:hAnsi="Helvetica" w:eastAsia="Helvetica" w:cs="Helvetica"/>
+                <w:b w:val="0"/>
+                <w:bCs w:val="0"/>
+                <w:i w:val="0"/>
+                <w:iCs w:val="0"/>
+                <w:color w:val="000000" w:themeColor="text1" w:themeTint="FF" w:themeShade="FF"/>
+                <w:sz w:val="16"/>
+                <w:szCs w:val="16"/>
+              </w:rPr>
             </w:pPr>
           </w:p>
         </w:tc>
@@ -1300,7 +1611,22 @@
           </w:tcPr>
           <w:p>
             <w:pPr>
-              <w:spacing w:before="0" w:beforeAutospacing="off" w:after="0" w:afterAutospacing="off"/>
+              <w:pStyle w:val="Normal"/>
+              <w:suppressLineNumbers w:val="0"/>
+              <w:bidi w:val="0"/>
+              <w:spacing w:before="0" w:beforeAutospacing="off" w:after="150" w:afterAutospacing="off" w:line="279" w:lineRule="auto"/>
+              <w:ind w:left="0" w:right="0"/>
+              <w:jc w:val="center"/>
+              <w:rPr>
+                <w:rFonts w:ascii="Helvetica" w:hAnsi="Helvetica" w:eastAsia="Helvetica" w:cs="Helvetica"/>
+                <w:b w:val="0"/>
+                <w:bCs w:val="0"/>
+                <w:i w:val="0"/>
+                <w:iCs w:val="0"/>
+                <w:color w:val="000000" w:themeColor="text1" w:themeTint="FF" w:themeShade="FF"/>
+                <w:sz w:val="16"/>
+                <w:szCs w:val="16"/>
+              </w:rPr>
             </w:pPr>
           </w:p>
         </w:tc>
@@ -1323,7 +1649,22 @@
           </w:tcPr>
           <w:p>
             <w:pPr>
-              <w:spacing w:before="0" w:beforeAutospacing="off" w:after="0" w:afterAutospacing="off"/>
+              <w:pStyle w:val="Normal"/>
+              <w:suppressLineNumbers w:val="0"/>
+              <w:bidi w:val="0"/>
+              <w:spacing w:before="0" w:beforeAutospacing="off" w:after="150" w:afterAutospacing="off" w:line="279" w:lineRule="auto"/>
+              <w:ind w:left="0" w:right="0"/>
+              <w:jc w:val="center"/>
+              <w:rPr>
+                <w:rFonts w:ascii="Helvetica" w:hAnsi="Helvetica" w:eastAsia="Helvetica" w:cs="Helvetica"/>
+                <w:b w:val="0"/>
+                <w:bCs w:val="0"/>
+                <w:i w:val="0"/>
+                <w:iCs w:val="0"/>
+                <w:color w:val="000000" w:themeColor="text1" w:themeTint="FF" w:themeShade="FF"/>
+                <w:sz w:val="16"/>
+                <w:szCs w:val="16"/>
+              </w:rPr>
             </w:pPr>
           </w:p>
         </w:tc>
@@ -1346,7 +1687,22 @@
           </w:tcPr>
           <w:p>
             <w:pPr>
-              <w:spacing w:before="0" w:beforeAutospacing="off" w:after="0" w:afterAutospacing="off"/>
+              <w:pStyle w:val="Normal"/>
+              <w:suppressLineNumbers w:val="0"/>
+              <w:bidi w:val="0"/>
+              <w:spacing w:before="0" w:beforeAutospacing="off" w:after="150" w:afterAutospacing="off" w:line="279" w:lineRule="auto"/>
+              <w:ind w:left="0" w:right="0"/>
+              <w:jc w:val="center"/>
+              <w:rPr>
+                <w:rFonts w:ascii="Helvetica" w:hAnsi="Helvetica" w:eastAsia="Helvetica" w:cs="Helvetica"/>
+                <w:b w:val="0"/>
+                <w:bCs w:val="0"/>
+                <w:i w:val="0"/>
+                <w:iCs w:val="0"/>
+                <w:color w:val="000000" w:themeColor="text1" w:themeTint="FF" w:themeShade="FF"/>
+                <w:sz w:val="16"/>
+                <w:szCs w:val="16"/>
+              </w:rPr>
             </w:pPr>
           </w:p>
         </w:tc>
@@ -1369,7 +1725,22 @@
           </w:tcPr>
           <w:p>
             <w:pPr>
-              <w:spacing w:before="0" w:beforeAutospacing="off" w:after="0" w:afterAutospacing="off"/>
+              <w:pStyle w:val="Normal"/>
+              <w:suppressLineNumbers w:val="0"/>
+              <w:bidi w:val="0"/>
+              <w:spacing w:before="0" w:beforeAutospacing="off" w:after="150" w:afterAutospacing="off" w:line="279" w:lineRule="auto"/>
+              <w:ind w:left="0" w:right="0"/>
+              <w:jc w:val="center"/>
+              <w:rPr>
+                <w:rFonts w:ascii="Helvetica" w:hAnsi="Helvetica" w:eastAsia="Helvetica" w:cs="Helvetica"/>
+                <w:b w:val="0"/>
+                <w:bCs w:val="0"/>
+                <w:i w:val="0"/>
+                <w:iCs w:val="0"/>
+                <w:color w:val="000000" w:themeColor="text1" w:themeTint="FF" w:themeShade="FF"/>
+                <w:sz w:val="16"/>
+                <w:szCs w:val="16"/>
+              </w:rPr>
             </w:pPr>
           </w:p>
         </w:tc>
@@ -1392,25 +1763,81 @@
           </w:tcPr>
           <w:p>
             <w:pPr>
-              <w:spacing w:before="0" w:beforeAutospacing="off" w:after="0" w:afterAutospacing="off"/>
-            </w:pPr>
-            <w:r>
-              <w:rPr>
-                <w:rFonts w:ascii="Helvetica" w:hAnsi="Helvetica" w:eastAsia="Helvetica" w:cs="Helvetica"/>
-                <w:b w:val="0"/>
-                <w:bCs w:val="0"/>
-                <w:i w:val="0"/>
-                <w:iCs w:val="0"/>
-                <w:color w:val="000000" w:themeColor="text1" w:themeTint="FF" w:themeShade="FF"/>
-                <w:sz w:val="16"/>
-                <w:szCs w:val="16"/>
-              </w:rPr>
-              <w:t xml:space="preserve">Week total: </w:t>
-            </w:r>
-          </w:p>
-          <w:p>
-            <w:pPr>
-              <w:spacing w:before="0" w:beforeAutospacing="off" w:after="0" w:afterAutospacing="off"/>
+              <w:pStyle w:val="Normal"/>
+              <w:suppressLineNumbers w:val="0"/>
+              <w:bidi w:val="0"/>
+              <w:spacing w:before="0" w:beforeAutospacing="off" w:after="150" w:afterAutospacing="off" w:line="279" w:lineRule="auto"/>
+              <w:ind w:left="0" w:right="0"/>
+              <w:jc w:val="center"/>
+              <w:rPr>
+                <w:rFonts w:ascii="Helvetica" w:hAnsi="Helvetica" w:eastAsia="Helvetica" w:cs="Helvetica"/>
+                <w:b w:val="0"/>
+                <w:bCs w:val="0"/>
+                <w:i w:val="0"/>
+                <w:iCs w:val="0"/>
+                <w:color w:val="000000" w:themeColor="text1" w:themeTint="FF" w:themeShade="FF"/>
+                <w:sz w:val="16"/>
+                <w:szCs w:val="16"/>
+              </w:rPr>
+            </w:pPr>
+            <w:r>
+              <w:rPr>
+                <w:rFonts w:ascii="Helvetica" w:hAnsi="Helvetica" w:eastAsia="Helvetica" w:cs="Helvetica"/>
+                <w:b w:val="0"/>
+                <w:bCs w:val="0"/>
+                <w:i w:val="0"/>
+                <w:iCs w:val="0"/>
+                <w:color w:val="000000" w:themeColor="text1" w:themeTint="FF" w:themeShade="FF"/>
+                <w:sz w:val="16"/>
+                <w:szCs w:val="16"/>
+              </w:rPr>
+              <w:t>Week</w:t>
+            </w:r>
+            <w:r>
+              <w:rPr>
+                <w:rFonts w:ascii="Helvetica" w:hAnsi="Helvetica" w:eastAsia="Helvetica" w:cs="Helvetica"/>
+                <w:b w:val="0"/>
+                <w:bCs w:val="0"/>
+                <w:i w:val="0"/>
+                <w:iCs w:val="0"/>
+                <w:color w:val="000000" w:themeColor="text1" w:themeTint="FF" w:themeShade="FF"/>
+                <w:sz w:val="16"/>
+                <w:szCs w:val="16"/>
+              </w:rPr>
+              <w:t>1</w:t>
+            </w:r>
+            <w:r>
+              <w:rPr>
+                <w:rFonts w:ascii="Helvetica" w:hAnsi="Helvetica" w:eastAsia="Helvetica" w:cs="Helvetica"/>
+                <w:b w:val="0"/>
+                <w:bCs w:val="0"/>
+                <w:i w:val="0"/>
+                <w:iCs w:val="0"/>
+                <w:color w:val="000000" w:themeColor="text1" w:themeTint="FF" w:themeShade="FF"/>
+                <w:sz w:val="16"/>
+                <w:szCs w:val="16"/>
+              </w:rPr>
+              <w:t xml:space="preserve"> total: </w:t>
+            </w:r>
+          </w:p>
+          <w:p>
+            <w:pPr>
+              <w:pStyle w:val="Normal"/>
+              <w:suppressLineNumbers w:val="0"/>
+              <w:bidi w:val="0"/>
+              <w:spacing w:before="0" w:beforeAutospacing="off" w:after="150" w:afterAutospacing="off" w:line="279" w:lineRule="auto"/>
+              <w:ind w:left="0" w:right="0"/>
+              <w:jc w:val="center"/>
+              <w:rPr>
+                <w:rFonts w:ascii="Helvetica" w:hAnsi="Helvetica" w:eastAsia="Helvetica" w:cs="Helvetica"/>
+                <w:b w:val="0"/>
+                <w:bCs w:val="0"/>
+                <w:i w:val="0"/>
+                <w:iCs w:val="0"/>
+                <w:color w:val="000000" w:themeColor="text1" w:themeTint="FF" w:themeShade="FF"/>
+                <w:sz w:val="16"/>
+                <w:szCs w:val="16"/>
+              </w:rPr>
             </w:pPr>
             <w:r>
               <w:rPr>
@@ -1464,25 +1891,82 @@
           </w:tcPr>
           <w:p>
             <w:pPr>
+              <w:bidi w:val="0"/>
               <w:spacing w:before="0" w:beforeAutospacing="off" w:after="0" w:afterAutospacing="off"/>
-            </w:pPr>
-            <w:r>
-              <w:rPr>
-                <w:rFonts w:ascii="Helvetica" w:hAnsi="Helvetica" w:eastAsia="Helvetica" w:cs="Helvetica"/>
-                <w:b w:val="0"/>
-                <w:bCs w:val="0"/>
-                <w:i w:val="0"/>
-                <w:iCs w:val="0"/>
-                <w:color w:val="000000" w:themeColor="text1" w:themeTint="FF" w:themeShade="FF"/>
-                <w:sz w:val="16"/>
-                <w:szCs w:val="16"/>
-              </w:rPr>
-              <w:t>Week 2 ...</w:t>
-            </w:r>
-          </w:p>
-          <w:p>
-            <w:pPr>
-              <w:spacing w:before="0" w:beforeAutospacing="off" w:after="0" w:afterAutospacing="off"/>
+              <w:jc w:val="center"/>
+            </w:pPr>
+            <w:r>
+              <w:rPr>
+                <w:rFonts w:ascii="Calibri" w:hAnsi="Calibri" w:eastAsia="Calibri" w:cs="Calibri"/>
+                <w:b w:val="0"/>
+                <w:bCs w:val="0"/>
+                <w:i w:val="0"/>
+                <w:iCs w:val="0"/>
+                <w:noProof w:val="0"/>
+                <w:color w:val="000000" w:themeColor="text1" w:themeTint="FF" w:themeShade="FF"/>
+                <w:sz w:val="16"/>
+                <w:szCs w:val="16"/>
+                <w:lang w:val="en-US"/>
+              </w:rPr>
+              <w:t>Week 2:</w:t>
+            </w:r>
+            <w:r>
+              <w:br/>
+            </w:r>
+            <w:r>
+              <w:rPr>
+                <w:rFonts w:ascii="Calibri" w:hAnsi="Calibri" w:eastAsia="Calibri" w:cs="Calibri"/>
+                <w:b w:val="0"/>
+                <w:bCs w:val="0"/>
+                <w:i w:val="0"/>
+                <w:iCs w:val="0"/>
+                <w:noProof w:val="0"/>
+                <w:color w:val="000000" w:themeColor="text1" w:themeTint="FF" w:themeShade="FF"/>
+                <w:sz w:val="16"/>
+                <w:szCs w:val="16"/>
+                <w:lang w:val="en-US"/>
+              </w:rPr>
+              <w:t xml:space="preserve"> 09/21/26- 09/28/26</w:t>
+            </w:r>
+          </w:p>
+          <w:p>
+            <w:pPr>
+              <w:pStyle w:val="Normal"/>
+              <w:suppressLineNumbers w:val="0"/>
+              <w:bidi w:val="0"/>
+              <w:spacing w:before="0" w:beforeAutospacing="off" w:after="150" w:afterAutospacing="off" w:line="279" w:lineRule="auto"/>
+              <w:ind w:left="0" w:right="0"/>
+              <w:jc w:val="center"/>
+              <w:rPr>
+                <w:rFonts w:ascii="Helvetica" w:hAnsi="Helvetica" w:eastAsia="Helvetica" w:cs="Helvetica"/>
+                <w:b w:val="0"/>
+                <w:bCs w:val="0"/>
+                <w:i w:val="0"/>
+                <w:iCs w:val="0"/>
+                <w:color w:val="000000" w:themeColor="text1" w:themeTint="FF" w:themeShade="FF"/>
+                <w:sz w:val="16"/>
+                <w:szCs w:val="16"/>
+              </w:rPr>
+            </w:pPr>
+          </w:p>
+          <w:p>
+            <w:pPr>
+              <w:pStyle w:val="Normal"/>
+              <w:suppressLineNumbers w:val="0"/>
+              <w:bidi w:val="0"/>
+              <w:spacing w:before="0" w:beforeAutospacing="off" w:after="150" w:afterAutospacing="off" w:line="279" w:lineRule="auto"/>
+              <w:ind w:left="0" w:right="0"/>
+              <w:jc w:val="center"/>
+              <w:rPr>
+                <w:rFonts w:ascii="Helvetica" w:hAnsi="Helvetica" w:eastAsia="Helvetica" w:cs="Helvetica"/>
+                <w:b w:val="0"/>
+                <w:bCs w:val="0"/>
+                <w:i w:val="0"/>
+                <w:iCs w:val="0"/>
+                <w:color w:val="000000" w:themeColor="text1" w:themeTint="FF" w:themeShade="FF"/>
+                <w:sz w:val="16"/>
+                <w:szCs w:val="16"/>
+              </w:rPr>
             </w:pPr>
           </w:p>
         </w:tc>
@@ -1505,8 +1989,36 @@
           </w:tcPr>
           <w:p>
             <w:pPr>
-              <w:spacing w:before="0" w:beforeAutospacing="off" w:after="0" w:afterAutospacing="off"/>
-            </w:pPr>
+              <w:pStyle w:val="Normal"/>
+              <w:suppressLineNumbers w:val="0"/>
+              <w:bidi w:val="0"/>
+              <w:spacing w:before="0" w:beforeAutospacing="off" w:after="150" w:afterAutospacing="off" w:line="279" w:lineRule="auto"/>
+              <w:ind w:left="0" w:right="0"/>
+              <w:jc w:val="center"/>
+              <w:rPr>
+                <w:rFonts w:ascii="Helvetica" w:hAnsi="Helvetica" w:eastAsia="Helvetica" w:cs="Helvetica"/>
+                <w:b w:val="0"/>
+                <w:bCs w:val="0"/>
+                <w:i w:val="0"/>
+                <w:iCs w:val="0"/>
+                <w:color w:val="000000" w:themeColor="text1" w:themeTint="FF" w:themeShade="FF"/>
+                <w:sz w:val="16"/>
+                <w:szCs w:val="16"/>
+              </w:rPr>
+            </w:pPr>
+            <w:r>
+              <w:rPr>
+                <w:rFonts w:ascii="Helvetica" w:hAnsi="Helvetica" w:eastAsia="Helvetica" w:cs="Helvetica"/>
+                <w:b w:val="0"/>
+                <w:bCs w:val="0"/>
+                <w:i w:val="0"/>
+                <w:iCs w:val="0"/>
+                <w:color w:val="000000" w:themeColor="text1" w:themeTint="FF" w:themeShade="FF"/>
+                <w:sz w:val="16"/>
+                <w:szCs w:val="16"/>
+              </w:rPr>
+              <w:t>Group meeting</w:t>
+            </w:r>
           </w:p>
         </w:tc>
         <w:tc>
@@ -1528,8 +2040,36 @@
           </w:tcPr>
           <w:p>
             <w:pPr>
-              <w:spacing w:before="0" w:beforeAutospacing="off" w:after="0" w:afterAutospacing="off"/>
-            </w:pPr>
+              <w:pStyle w:val="Normal"/>
+              <w:suppressLineNumbers w:val="0"/>
+              <w:bidi w:val="0"/>
+              <w:spacing w:before="0" w:beforeAutospacing="off" w:after="150" w:afterAutospacing="off" w:line="279" w:lineRule="auto"/>
+              <w:ind w:left="0" w:right="0"/>
+              <w:jc w:val="center"/>
+              <w:rPr>
+                <w:rFonts w:ascii="Helvetica" w:hAnsi="Helvetica" w:eastAsia="Helvetica" w:cs="Helvetica"/>
+                <w:b w:val="0"/>
+                <w:bCs w:val="0"/>
+                <w:i w:val="0"/>
+                <w:iCs w:val="0"/>
+                <w:color w:val="000000" w:themeColor="text1" w:themeTint="FF" w:themeShade="FF"/>
+                <w:sz w:val="16"/>
+                <w:szCs w:val="16"/>
+              </w:rPr>
+            </w:pPr>
+            <w:r>
+              <w:rPr>
+                <w:rFonts w:ascii="Helvetica" w:hAnsi="Helvetica" w:eastAsia="Helvetica" w:cs="Helvetica"/>
+                <w:b w:val="0"/>
+                <w:bCs w:val="0"/>
+                <w:i w:val="0"/>
+                <w:iCs w:val="0"/>
+                <w:color w:val="000000" w:themeColor="text1" w:themeTint="FF" w:themeShade="FF"/>
+                <w:sz w:val="16"/>
+                <w:szCs w:val="16"/>
+              </w:rPr>
+              <w:t>09/22/26</w:t>
+            </w:r>
           </w:p>
         </w:tc>
         <w:tc>
@@ -1551,8 +2091,36 @@
           </w:tcPr>
           <w:p>
             <w:pPr>
-              <w:spacing w:before="0" w:beforeAutospacing="off" w:after="0" w:afterAutospacing="off"/>
-            </w:pPr>
+              <w:pStyle w:val="Normal"/>
+              <w:suppressLineNumbers w:val="0"/>
+              <w:bidi w:val="0"/>
+              <w:spacing w:before="0" w:beforeAutospacing="off" w:after="150" w:afterAutospacing="off" w:line="279" w:lineRule="auto"/>
+              <w:ind w:left="0" w:right="0"/>
+              <w:jc w:val="center"/>
+              <w:rPr>
+                <w:rFonts w:ascii="Helvetica" w:hAnsi="Helvetica" w:eastAsia="Helvetica" w:cs="Helvetica"/>
+                <w:b w:val="0"/>
+                <w:bCs w:val="0"/>
+                <w:i w:val="0"/>
+                <w:iCs w:val="0"/>
+                <w:color w:val="000000" w:themeColor="text1" w:themeTint="FF" w:themeShade="FF"/>
+                <w:sz w:val="16"/>
+                <w:szCs w:val="16"/>
+              </w:rPr>
+            </w:pPr>
+            <w:r>
+              <w:rPr>
+                <w:rFonts w:ascii="Helvetica" w:hAnsi="Helvetica" w:eastAsia="Helvetica" w:cs="Helvetica"/>
+                <w:b w:val="0"/>
+                <w:bCs w:val="0"/>
+                <w:i w:val="0"/>
+                <w:iCs w:val="0"/>
+                <w:color w:val="000000" w:themeColor="text1" w:themeTint="FF" w:themeShade="FF"/>
+                <w:sz w:val="16"/>
+                <w:szCs w:val="16"/>
+              </w:rPr>
+              <w:t>2pm</w:t>
+            </w:r>
           </w:p>
         </w:tc>
         <w:tc>
@@ -1574,8 +2142,62 @@
           </w:tcPr>
           <w:p>
             <w:pPr>
-              <w:spacing w:before="0" w:beforeAutospacing="off" w:after="0" w:afterAutospacing="off"/>
-            </w:pPr>
+              <w:pStyle w:val="Normal"/>
+              <w:suppressLineNumbers w:val="0"/>
+              <w:bidi w:val="0"/>
+              <w:spacing w:before="0" w:beforeAutospacing="off" w:after="150" w:afterAutospacing="off" w:line="279" w:lineRule="auto"/>
+              <w:ind w:left="0" w:right="0"/>
+              <w:jc w:val="center"/>
+              <w:rPr>
+                <w:rFonts w:ascii="Helvetica" w:hAnsi="Helvetica" w:eastAsia="Helvetica" w:cs="Helvetica"/>
+                <w:b w:val="0"/>
+                <w:bCs w:val="0"/>
+                <w:i w:val="0"/>
+                <w:iCs w:val="0"/>
+                <w:color w:val="000000" w:themeColor="text1" w:themeTint="FF" w:themeShade="FF"/>
+                <w:sz w:val="16"/>
+                <w:szCs w:val="16"/>
+              </w:rPr>
+            </w:pPr>
+            <w:r>
+              <w:rPr>
+                <w:rFonts w:ascii="Helvetica" w:hAnsi="Helvetica" w:eastAsia="Helvetica" w:cs="Helvetica"/>
+                <w:b w:val="0"/>
+                <w:bCs w:val="0"/>
+                <w:i w:val="0"/>
+                <w:iCs w:val="0"/>
+                <w:color w:val="000000" w:themeColor="text1" w:themeTint="FF" w:themeShade="FF"/>
+                <w:sz w:val="16"/>
+                <w:szCs w:val="16"/>
+              </w:rPr>
+              <w:t>2:20</w:t>
+            </w:r>
+            <w:r>
+              <w:rPr>
+                <w:rFonts w:ascii="Helvetica" w:hAnsi="Helvetica" w:eastAsia="Helvetica" w:cs="Helvetica"/>
+                <w:b w:val="0"/>
+                <w:bCs w:val="0"/>
+                <w:i w:val="0"/>
+                <w:iCs w:val="0"/>
+                <w:color w:val="000000" w:themeColor="text1" w:themeTint="FF" w:themeShade="FF"/>
+                <w:sz w:val="16"/>
+                <w:szCs w:val="16"/>
+              </w:rPr>
+              <w:t xml:space="preserve"> </w:t>
+            </w:r>
+            <w:r>
+              <w:rPr>
+                <w:rFonts w:ascii="Helvetica" w:hAnsi="Helvetica" w:eastAsia="Helvetica" w:cs="Helvetica"/>
+                <w:b w:val="0"/>
+                <w:bCs w:val="0"/>
+                <w:i w:val="0"/>
+                <w:iCs w:val="0"/>
+                <w:color w:val="000000" w:themeColor="text1" w:themeTint="FF" w:themeShade="FF"/>
+                <w:sz w:val="16"/>
+                <w:szCs w:val="16"/>
+              </w:rPr>
+              <w:t>pm</w:t>
+            </w:r>
           </w:p>
         </w:tc>
         <w:tc>
@@ -1597,8 +2219,36 @@
           </w:tcPr>
           <w:p>
             <w:pPr>
-              <w:spacing w:before="0" w:beforeAutospacing="off" w:after="0" w:afterAutospacing="off"/>
-            </w:pPr>
+              <w:pStyle w:val="Normal"/>
+              <w:suppressLineNumbers w:val="0"/>
+              <w:bidi w:val="0"/>
+              <w:spacing w:before="0" w:beforeAutospacing="off" w:after="150" w:afterAutospacing="off" w:line="279" w:lineRule="auto"/>
+              <w:ind w:left="0" w:right="0"/>
+              <w:jc w:val="center"/>
+              <w:rPr>
+                <w:rFonts w:ascii="Helvetica" w:hAnsi="Helvetica" w:eastAsia="Helvetica" w:cs="Helvetica"/>
+                <w:b w:val="0"/>
+                <w:bCs w:val="0"/>
+                <w:i w:val="0"/>
+                <w:iCs w:val="0"/>
+                <w:color w:val="000000" w:themeColor="text1" w:themeTint="FF" w:themeShade="FF"/>
+                <w:sz w:val="16"/>
+                <w:szCs w:val="16"/>
+              </w:rPr>
+            </w:pPr>
+            <w:r>
+              <w:rPr>
+                <w:rFonts w:ascii="Helvetica" w:hAnsi="Helvetica" w:eastAsia="Helvetica" w:cs="Helvetica"/>
+                <w:b w:val="0"/>
+                <w:bCs w:val="0"/>
+                <w:i w:val="0"/>
+                <w:iCs w:val="0"/>
+                <w:color w:val="000000" w:themeColor="text1" w:themeTint="FF" w:themeShade="FF"/>
+                <w:sz w:val="16"/>
+                <w:szCs w:val="16"/>
+              </w:rPr>
+              <w:t>20 min</w:t>
+            </w:r>
           </w:p>
         </w:tc>
       </w:tr>
@@ -1625,7 +2275,22 @@
           </w:tcPr>
           <w:p>
             <w:pPr>
-              <w:spacing w:before="0" w:beforeAutospacing="off" w:after="0" w:afterAutospacing="off"/>
+              <w:pStyle w:val="Normal"/>
+              <w:suppressLineNumbers w:val="0"/>
+              <w:bidi w:val="0"/>
+              <w:spacing w:before="0" w:beforeAutospacing="off" w:after="150" w:afterAutospacing="off" w:line="279" w:lineRule="auto"/>
+              <w:ind w:left="0" w:right="0"/>
+              <w:jc w:val="center"/>
+              <w:rPr>
+                <w:rFonts w:ascii="Helvetica" w:hAnsi="Helvetica" w:eastAsia="Helvetica" w:cs="Helvetica"/>
+                <w:b w:val="0"/>
+                <w:bCs w:val="0"/>
+                <w:i w:val="0"/>
+                <w:iCs w:val="0"/>
+                <w:color w:val="000000" w:themeColor="text1" w:themeTint="FF" w:themeShade="FF"/>
+                <w:sz w:val="16"/>
+                <w:szCs w:val="16"/>
+              </w:rPr>
             </w:pPr>
           </w:p>
         </w:tc>
@@ -1648,7 +2313,59 @@
           </w:tcPr>
           <w:p>
             <w:pPr>
-              <w:spacing w:before="0" w:beforeAutospacing="off" w:after="0" w:afterAutospacing="off"/>
+              <w:pStyle w:val="Normal"/>
+              <w:suppressLineNumbers w:val="0"/>
+              <w:bidi w:val="0"/>
+              <w:spacing w:before="0" w:beforeAutospacing="off" w:after="150" w:afterAutospacing="off" w:line="279" w:lineRule="auto"/>
+              <w:ind w:left="0" w:right="0"/>
+              <w:jc w:val="center"/>
+              <w:rPr>
+                <w:rFonts w:ascii="Helvetica" w:hAnsi="Helvetica" w:eastAsia="Helvetica" w:cs="Helvetica"/>
+                <w:b w:val="0"/>
+                <w:bCs w:val="0"/>
+                <w:i w:val="0"/>
+                <w:iCs w:val="0"/>
+                <w:noProof w:val="0"/>
+                <w:color w:val="000000" w:themeColor="text1" w:themeTint="FF" w:themeShade="FF"/>
+                <w:sz w:val="16"/>
+                <w:szCs w:val="16"/>
+                <w:lang w:val="en-US"/>
+              </w:rPr>
+            </w:pPr>
+            <w:r>
+              <w:rPr>
+                <w:rFonts w:ascii="Helvetica" w:hAnsi="Helvetica" w:eastAsia="Helvetica" w:cs="Helvetica"/>
+                <w:b w:val="0"/>
+                <w:bCs w:val="0"/>
+                <w:i w:val="0"/>
+                <w:iCs w:val="0"/>
+                <w:noProof w:val="0"/>
+                <w:color w:val="000000" w:themeColor="text1" w:themeTint="FF" w:themeShade="FF"/>
+                <w:sz w:val="16"/>
+                <w:szCs w:val="16"/>
+                <w:lang w:val="en-US"/>
+              </w:rPr>
+              <w:t>Creating LMS UI mockup in Moqups</w:t>
+            </w:r>
+          </w:p>
+          <w:p>
+            <w:pPr>
+              <w:pStyle w:val="Normal"/>
+              <w:suppressLineNumbers w:val="0"/>
+              <w:bidi w:val="0"/>
+              <w:spacing w:before="0" w:beforeAutospacing="off" w:after="150" w:afterAutospacing="off" w:line="279" w:lineRule="auto"/>
+              <w:ind w:left="0" w:right="0"/>
+              <w:jc w:val="center"/>
+              <w:rPr>
+                <w:rFonts w:ascii="Helvetica" w:hAnsi="Helvetica" w:eastAsia="Helvetica" w:cs="Helvetica"/>
+                <w:b w:val="0"/>
+                <w:bCs w:val="0"/>
+                <w:i w:val="0"/>
+                <w:iCs w:val="0"/>
+                <w:color w:val="000000" w:themeColor="text1" w:themeTint="FF" w:themeShade="FF"/>
+                <w:sz w:val="16"/>
+                <w:szCs w:val="16"/>
+              </w:rPr>
             </w:pPr>
           </w:p>
         </w:tc>
@@ -1671,7 +2388,55 @@
           </w:tcPr>
           <w:p>
             <w:pPr>
-              <w:spacing w:before="0" w:beforeAutospacing="off" w:after="0" w:afterAutospacing="off"/>
+              <w:pStyle w:val="Normal"/>
+              <w:suppressLineNumbers w:val="0"/>
+              <w:bidi w:val="0"/>
+              <w:spacing w:before="0" w:beforeAutospacing="off" w:after="150" w:afterAutospacing="off" w:line="279" w:lineRule="auto"/>
+              <w:ind w:left="0" w:right="0"/>
+              <w:jc w:val="center"/>
+              <w:rPr>
+                <w:rFonts w:ascii="Helvetica" w:hAnsi="Helvetica" w:eastAsia="Helvetica" w:cs="Helvetica"/>
+                <w:b w:val="0"/>
+                <w:bCs w:val="0"/>
+                <w:i w:val="0"/>
+                <w:iCs w:val="0"/>
+                <w:color w:val="000000" w:themeColor="text1" w:themeTint="FF" w:themeShade="FF"/>
+                <w:sz w:val="16"/>
+                <w:szCs w:val="16"/>
+              </w:rPr>
+            </w:pPr>
+            <w:r>
+              <w:rPr>
+                <w:rFonts w:ascii="Helvetica" w:hAnsi="Helvetica" w:eastAsia="Helvetica" w:cs="Helvetica"/>
+                <w:b w:val="0"/>
+                <w:bCs w:val="0"/>
+                <w:i w:val="0"/>
+                <w:iCs w:val="0"/>
+                <w:color w:val="000000" w:themeColor="text1" w:themeTint="FF" w:themeShade="FF"/>
+                <w:sz w:val="16"/>
+                <w:szCs w:val="16"/>
+              </w:rPr>
+              <w:t>09/24/26</w:t>
+            </w:r>
+          </w:p>
+          <w:p>
+            <w:pPr>
+              <w:pStyle w:val="Normal"/>
+              <w:suppressLineNumbers w:val="0"/>
+              <w:bidi w:val="0"/>
+              <w:spacing w:before="0" w:beforeAutospacing="off" w:after="150" w:afterAutospacing="off" w:line="279" w:lineRule="auto"/>
+              <w:ind w:left="0" w:right="0"/>
+              <w:jc w:val="center"/>
+              <w:rPr>
+                <w:rFonts w:ascii="Helvetica" w:hAnsi="Helvetica" w:eastAsia="Helvetica" w:cs="Helvetica"/>
+                <w:b w:val="0"/>
+                <w:bCs w:val="0"/>
+                <w:i w:val="0"/>
+                <w:iCs w:val="0"/>
+                <w:color w:val="000000" w:themeColor="text1" w:themeTint="FF" w:themeShade="FF"/>
+                <w:sz w:val="16"/>
+                <w:szCs w:val="16"/>
+              </w:rPr>
             </w:pPr>
           </w:p>
         </w:tc>
@@ -1694,8 +2459,69 @@
           </w:tcPr>
           <w:p>
             <w:pPr>
-              <w:spacing w:before="0" w:beforeAutospacing="off" w:after="0" w:afterAutospacing="off"/>
-            </w:pPr>
+              <w:pStyle w:val="Normal"/>
+              <w:suppressLineNumbers w:val="0"/>
+              <w:bidi w:val="0"/>
+              <w:spacing w:before="0" w:beforeAutospacing="off" w:after="150" w:afterAutospacing="off" w:line="279" w:lineRule="auto"/>
+              <w:ind w:left="0" w:right="0"/>
+              <w:jc w:val="center"/>
+              <w:rPr>
+                <w:rFonts w:ascii="Helvetica" w:hAnsi="Helvetica" w:eastAsia="Helvetica" w:cs="Helvetica"/>
+                <w:b w:val="0"/>
+                <w:bCs w:val="0"/>
+                <w:i w:val="0"/>
+                <w:iCs w:val="0"/>
+                <w:color w:val="000000" w:themeColor="text1" w:themeTint="FF" w:themeShade="FF"/>
+                <w:sz w:val="16"/>
+                <w:szCs w:val="16"/>
+              </w:rPr>
+            </w:pPr>
+            <w:r>
+              <w:rPr>
+                <w:rFonts w:ascii="Helvetica" w:hAnsi="Helvetica" w:eastAsia="Helvetica" w:cs="Helvetica"/>
+                <w:b w:val="0"/>
+                <w:bCs w:val="0"/>
+                <w:i w:val="0"/>
+                <w:iCs w:val="0"/>
+                <w:color w:val="000000" w:themeColor="text1" w:themeTint="FF" w:themeShade="FF"/>
+                <w:sz w:val="16"/>
+                <w:szCs w:val="16"/>
+              </w:rPr>
+              <w:t>1 pm</w:t>
+            </w:r>
+          </w:p>
+          <w:p>
+            <w:pPr>
+              <w:pStyle w:val="Normal"/>
+              <w:suppressLineNumbers w:val="0"/>
+              <w:bidi w:val="0"/>
+              <w:spacing w:before="0" w:beforeAutospacing="off" w:after="150" w:afterAutospacing="off" w:line="279" w:lineRule="auto"/>
+              <w:ind w:left="0" w:right="0"/>
+              <w:jc w:val="center"/>
+              <w:rPr>
+                <w:rFonts w:ascii="Helvetica" w:hAnsi="Helvetica" w:eastAsia="Helvetica" w:cs="Helvetica"/>
+                <w:b w:val="0"/>
+                <w:bCs w:val="0"/>
+                <w:i w:val="0"/>
+                <w:iCs w:val="0"/>
+                <w:color w:val="000000" w:themeColor="text1" w:themeTint="FF" w:themeShade="FF"/>
+                <w:sz w:val="16"/>
+                <w:szCs w:val="16"/>
+              </w:rPr>
+            </w:pPr>
+            <w:r>
+              <w:rPr>
+                <w:rFonts w:ascii="Helvetica" w:hAnsi="Helvetica" w:eastAsia="Helvetica" w:cs="Helvetica"/>
+                <w:b w:val="0"/>
+                <w:bCs w:val="0"/>
+                <w:i w:val="0"/>
+                <w:iCs w:val="0"/>
+                <w:color w:val="000000" w:themeColor="text1" w:themeTint="FF" w:themeShade="FF"/>
+                <w:sz w:val="16"/>
+                <w:szCs w:val="16"/>
+              </w:rPr>
+              <w:t xml:space="preserve"> </w:t>
+            </w:r>
           </w:p>
         </w:tc>
         <w:tc>
@@ -1717,8 +2543,36 @@
           </w:tcPr>
           <w:p>
             <w:pPr>
-              <w:spacing w:before="0" w:beforeAutospacing="off" w:after="0" w:afterAutospacing="off"/>
-            </w:pPr>
+              <w:pStyle w:val="Normal"/>
+              <w:suppressLineNumbers w:val="0"/>
+              <w:bidi w:val="0"/>
+              <w:spacing w:before="0" w:beforeAutospacing="off" w:after="150" w:afterAutospacing="off" w:line="279" w:lineRule="auto"/>
+              <w:ind w:left="0" w:right="0"/>
+              <w:jc w:val="center"/>
+              <w:rPr>
+                <w:rFonts w:ascii="Helvetica" w:hAnsi="Helvetica" w:eastAsia="Helvetica" w:cs="Helvetica"/>
+                <w:b w:val="0"/>
+                <w:bCs w:val="0"/>
+                <w:i w:val="0"/>
+                <w:iCs w:val="0"/>
+                <w:color w:val="000000" w:themeColor="text1" w:themeTint="FF" w:themeShade="FF"/>
+                <w:sz w:val="16"/>
+                <w:szCs w:val="16"/>
+              </w:rPr>
+            </w:pPr>
+            <w:r>
+              <w:rPr>
+                <w:rFonts w:ascii="Helvetica" w:hAnsi="Helvetica" w:eastAsia="Helvetica" w:cs="Helvetica"/>
+                <w:b w:val="0"/>
+                <w:bCs w:val="0"/>
+                <w:i w:val="0"/>
+                <w:iCs w:val="0"/>
+                <w:color w:val="000000" w:themeColor="text1" w:themeTint="FF" w:themeShade="FF"/>
+                <w:sz w:val="16"/>
+                <w:szCs w:val="16"/>
+              </w:rPr>
+              <w:t>2:30 pm</w:t>
+            </w:r>
           </w:p>
         </w:tc>
         <w:tc>
@@ -1740,8 +2594,36 @@
           </w:tcPr>
           <w:p>
             <w:pPr>
-              <w:spacing w:before="0" w:beforeAutospacing="off" w:after="0" w:afterAutospacing="off"/>
-            </w:pPr>
+              <w:pStyle w:val="Normal"/>
+              <w:suppressLineNumbers w:val="0"/>
+              <w:bidi w:val="0"/>
+              <w:spacing w:before="0" w:beforeAutospacing="off" w:after="150" w:afterAutospacing="off" w:line="279" w:lineRule="auto"/>
+              <w:ind w:left="0" w:right="0"/>
+              <w:jc w:val="center"/>
+              <w:rPr>
+                <w:rFonts w:ascii="Helvetica" w:hAnsi="Helvetica" w:eastAsia="Helvetica" w:cs="Helvetica"/>
+                <w:b w:val="0"/>
+                <w:bCs w:val="0"/>
+                <w:i w:val="0"/>
+                <w:iCs w:val="0"/>
+                <w:color w:val="000000" w:themeColor="text1" w:themeTint="FF" w:themeShade="FF"/>
+                <w:sz w:val="16"/>
+                <w:szCs w:val="16"/>
+              </w:rPr>
+            </w:pPr>
+            <w:r>
+              <w:rPr>
+                <w:rFonts w:ascii="Helvetica" w:hAnsi="Helvetica" w:eastAsia="Helvetica" w:cs="Helvetica"/>
+                <w:b w:val="0"/>
+                <w:bCs w:val="0"/>
+                <w:i w:val="0"/>
+                <w:iCs w:val="0"/>
+                <w:color w:val="000000" w:themeColor="text1" w:themeTint="FF" w:themeShade="FF"/>
+                <w:sz w:val="16"/>
+                <w:szCs w:val="16"/>
+              </w:rPr>
+              <w:t>90 min</w:t>
+            </w:r>
           </w:p>
         </w:tc>
       </w:tr>
@@ -1768,7 +2650,1057 @@
           </w:tcPr>
           <w:p>
             <w:pPr>
+              <w:pStyle w:val="Normal"/>
+              <w:suppressLineNumbers w:val="0"/>
+              <w:bidi w:val="0"/>
+              <w:spacing w:before="0" w:beforeAutospacing="off" w:after="150" w:afterAutospacing="off" w:line="279" w:lineRule="auto"/>
+              <w:ind w:left="0" w:right="0"/>
+              <w:jc w:val="center"/>
+              <w:rPr>
+                <w:rFonts w:ascii="Helvetica" w:hAnsi="Helvetica" w:eastAsia="Helvetica" w:cs="Helvetica"/>
+                <w:b w:val="0"/>
+                <w:bCs w:val="0"/>
+                <w:i w:val="0"/>
+                <w:iCs w:val="0"/>
+                <w:color w:val="000000" w:themeColor="text1" w:themeTint="FF" w:themeShade="FF"/>
+                <w:sz w:val="16"/>
+                <w:szCs w:val="16"/>
+              </w:rPr>
+            </w:pPr>
+          </w:p>
+        </w:tc>
+        <w:tc>
+          <w:tcPr>
+            <w:tcW w:w="1500" w:type="dxa"/>
+            <w:tcBorders>
+              <w:top w:val="single" w:color="000000" w:themeColor="text1" w:sz="6"/>
+              <w:left w:val="single" w:color="000000" w:themeColor="text1" w:sz="6"/>
+              <w:bottom w:val="single" w:color="000000" w:themeColor="text1" w:sz="6"/>
+              <w:right w:val="single" w:color="000000" w:themeColor="text1" w:sz="6"/>
+            </w:tcBorders>
+            <w:tcMar>
+              <w:top w:w="60" w:type="dxa"/>
+              <w:left w:w="60" w:type="dxa"/>
+              <w:bottom w:w="60" w:type="dxa"/>
+              <w:right w:w="60" w:type="dxa"/>
+            </w:tcMar>
+            <w:vAlign w:val="top"/>
+          </w:tcPr>
+          <w:p>
+            <w:pPr>
+              <w:pStyle w:val="Normal"/>
+              <w:suppressLineNumbers w:val="0"/>
+              <w:bidi w:val="0"/>
+              <w:spacing w:before="0" w:beforeAutospacing="off" w:after="150" w:afterAutospacing="off" w:line="279" w:lineRule="auto"/>
+              <w:ind w:left="0" w:right="0"/>
+              <w:jc w:val="center"/>
+              <w:rPr>
+                <w:rFonts w:ascii="Helvetica" w:hAnsi="Helvetica" w:eastAsia="Helvetica" w:cs="Helvetica"/>
+                <w:b w:val="0"/>
+                <w:bCs w:val="0"/>
+                <w:i w:val="0"/>
+                <w:iCs w:val="0"/>
+                <w:color w:val="000000" w:themeColor="text1" w:themeTint="FF" w:themeShade="FF"/>
+                <w:sz w:val="16"/>
+                <w:szCs w:val="16"/>
+              </w:rPr>
+            </w:pPr>
+            <w:r>
+              <w:rPr>
+                <w:rFonts w:ascii="Helvetica" w:hAnsi="Helvetica" w:eastAsia="Helvetica" w:cs="Helvetica"/>
+                <w:b w:val="0"/>
+                <w:bCs w:val="0"/>
+                <w:i w:val="0"/>
+                <w:iCs w:val="0"/>
+                <w:color w:val="000000" w:themeColor="text1" w:themeTint="FF" w:themeShade="FF"/>
+                <w:sz w:val="16"/>
+                <w:szCs w:val="16"/>
+              </w:rPr>
+              <w:t>Uploading doc to github</w:t>
+            </w:r>
+          </w:p>
+          <w:p>
+            <w:pPr>
+              <w:pStyle w:val="Normal"/>
+              <w:suppressLineNumbers w:val="0"/>
+              <w:bidi w:val="0"/>
+              <w:spacing w:before="0" w:beforeAutospacing="off" w:after="150" w:afterAutospacing="off" w:line="279" w:lineRule="auto"/>
+              <w:ind w:left="0" w:right="0"/>
+              <w:jc w:val="center"/>
+              <w:rPr>
+                <w:rFonts w:ascii="Helvetica" w:hAnsi="Helvetica" w:eastAsia="Helvetica" w:cs="Helvetica"/>
+                <w:b w:val="0"/>
+                <w:bCs w:val="0"/>
+                <w:i w:val="0"/>
+                <w:iCs w:val="0"/>
+                <w:color w:val="000000" w:themeColor="text1" w:themeTint="FF" w:themeShade="FF"/>
+                <w:sz w:val="16"/>
+                <w:szCs w:val="16"/>
+              </w:rPr>
+            </w:pPr>
+          </w:p>
+        </w:tc>
+        <w:tc>
+          <w:tcPr>
+            <w:tcW w:w="1155" w:type="dxa"/>
+            <w:tcBorders>
+              <w:top w:val="single" w:color="000000" w:themeColor="text1" w:sz="6"/>
+              <w:left w:val="single" w:color="000000" w:themeColor="text1" w:sz="6"/>
+              <w:bottom w:val="single" w:color="000000" w:themeColor="text1" w:sz="6"/>
+              <w:right w:val="single" w:color="000000" w:themeColor="text1" w:sz="6"/>
+            </w:tcBorders>
+            <w:tcMar>
+              <w:top w:w="60" w:type="dxa"/>
+              <w:left w:w="60" w:type="dxa"/>
+              <w:bottom w:w="60" w:type="dxa"/>
+              <w:right w:w="60" w:type="dxa"/>
+            </w:tcMar>
+            <w:vAlign w:val="top"/>
+          </w:tcPr>
+          <w:p>
+            <w:pPr>
+              <w:pStyle w:val="Normal"/>
+              <w:suppressLineNumbers w:val="0"/>
+              <w:bidi w:val="0"/>
+              <w:spacing w:before="0" w:beforeAutospacing="off" w:after="150" w:afterAutospacing="off" w:line="279" w:lineRule="auto"/>
+              <w:ind w:left="0" w:right="0"/>
+              <w:jc w:val="center"/>
+              <w:rPr>
+                <w:rFonts w:ascii="Helvetica" w:hAnsi="Helvetica" w:eastAsia="Helvetica" w:cs="Helvetica"/>
+                <w:b w:val="0"/>
+                <w:bCs w:val="0"/>
+                <w:i w:val="0"/>
+                <w:iCs w:val="0"/>
+                <w:color w:val="000000" w:themeColor="text1" w:themeTint="FF" w:themeShade="FF"/>
+                <w:sz w:val="16"/>
+                <w:szCs w:val="16"/>
+              </w:rPr>
+            </w:pPr>
+            <w:r>
+              <w:rPr>
+                <w:rFonts w:ascii="Helvetica" w:hAnsi="Helvetica" w:eastAsia="Helvetica" w:cs="Helvetica"/>
+                <w:b w:val="0"/>
+                <w:bCs w:val="0"/>
+                <w:i w:val="0"/>
+                <w:iCs w:val="0"/>
+                <w:color w:val="000000" w:themeColor="text1" w:themeTint="FF" w:themeShade="FF"/>
+                <w:sz w:val="16"/>
+                <w:szCs w:val="16"/>
+              </w:rPr>
+              <w:t>09/2</w:t>
+            </w:r>
+            <w:r>
+              <w:rPr>
+                <w:rFonts w:ascii="Helvetica" w:hAnsi="Helvetica" w:eastAsia="Helvetica" w:cs="Helvetica"/>
+                <w:b w:val="0"/>
+                <w:bCs w:val="0"/>
+                <w:i w:val="0"/>
+                <w:iCs w:val="0"/>
+                <w:color w:val="000000" w:themeColor="text1" w:themeTint="FF" w:themeShade="FF"/>
+                <w:sz w:val="16"/>
+                <w:szCs w:val="16"/>
+              </w:rPr>
+              <w:t>7</w:t>
+            </w:r>
+            <w:r>
+              <w:rPr>
+                <w:rFonts w:ascii="Helvetica" w:hAnsi="Helvetica" w:eastAsia="Helvetica" w:cs="Helvetica"/>
+                <w:b w:val="0"/>
+                <w:bCs w:val="0"/>
+                <w:i w:val="0"/>
+                <w:iCs w:val="0"/>
+                <w:color w:val="000000" w:themeColor="text1" w:themeTint="FF" w:themeShade="FF"/>
+                <w:sz w:val="16"/>
+                <w:szCs w:val="16"/>
+              </w:rPr>
+              <w:t>/26</w:t>
+            </w:r>
+          </w:p>
+        </w:tc>
+        <w:tc>
+          <w:tcPr>
+            <w:tcW w:w="1305" w:type="dxa"/>
+            <w:tcBorders>
+              <w:top w:val="single" w:color="000000" w:themeColor="text1" w:sz="6"/>
+              <w:left w:val="single" w:color="000000" w:themeColor="text1" w:sz="6"/>
+              <w:bottom w:val="single" w:color="000000" w:themeColor="text1" w:sz="6"/>
+              <w:right w:val="single" w:color="000000" w:themeColor="text1" w:sz="6"/>
+            </w:tcBorders>
+            <w:tcMar>
+              <w:top w:w="60" w:type="dxa"/>
+              <w:left w:w="60" w:type="dxa"/>
+              <w:bottom w:w="60" w:type="dxa"/>
+              <w:right w:w="60" w:type="dxa"/>
+            </w:tcMar>
+            <w:vAlign w:val="top"/>
+          </w:tcPr>
+          <w:p>
+            <w:pPr>
+              <w:pStyle w:val="Normal"/>
+              <w:suppressLineNumbers w:val="0"/>
+              <w:bidi w:val="0"/>
+              <w:spacing w:before="0" w:beforeAutospacing="off" w:after="150" w:afterAutospacing="off" w:line="279" w:lineRule="auto"/>
+              <w:ind w:left="0" w:right="0"/>
+              <w:jc w:val="center"/>
+              <w:rPr>
+                <w:rFonts w:ascii="Helvetica" w:hAnsi="Helvetica" w:eastAsia="Helvetica" w:cs="Helvetica"/>
+                <w:b w:val="0"/>
+                <w:bCs w:val="0"/>
+                <w:i w:val="0"/>
+                <w:iCs w:val="0"/>
+                <w:color w:val="000000" w:themeColor="text1" w:themeTint="FF" w:themeShade="FF"/>
+                <w:sz w:val="16"/>
+                <w:szCs w:val="16"/>
+              </w:rPr>
+            </w:pPr>
+            <w:r>
+              <w:rPr>
+                <w:rFonts w:ascii="Helvetica" w:hAnsi="Helvetica" w:eastAsia="Helvetica" w:cs="Helvetica"/>
+                <w:b w:val="0"/>
+                <w:bCs w:val="0"/>
+                <w:i w:val="0"/>
+                <w:iCs w:val="0"/>
+                <w:color w:val="000000" w:themeColor="text1" w:themeTint="FF" w:themeShade="FF"/>
+                <w:sz w:val="16"/>
+                <w:szCs w:val="16"/>
+              </w:rPr>
+              <w:t>2:00</w:t>
+            </w:r>
+            <w:r>
+              <w:rPr>
+                <w:rFonts w:ascii="Helvetica" w:hAnsi="Helvetica" w:eastAsia="Helvetica" w:cs="Helvetica"/>
+                <w:b w:val="0"/>
+                <w:bCs w:val="0"/>
+                <w:i w:val="0"/>
+                <w:iCs w:val="0"/>
+                <w:color w:val="000000" w:themeColor="text1" w:themeTint="FF" w:themeShade="FF"/>
+                <w:sz w:val="16"/>
+                <w:szCs w:val="16"/>
+              </w:rPr>
+              <w:t xml:space="preserve"> pm</w:t>
+            </w:r>
+          </w:p>
+        </w:tc>
+        <w:tc>
+          <w:tcPr>
+            <w:tcW w:w="1380" w:type="dxa"/>
+            <w:tcBorders>
+              <w:top w:val="single" w:color="000000" w:themeColor="text1" w:sz="6"/>
+              <w:left w:val="single" w:color="000000" w:themeColor="text1" w:sz="6"/>
+              <w:bottom w:val="single" w:color="000000" w:themeColor="text1" w:sz="6"/>
+              <w:right w:val="single" w:color="000000" w:themeColor="text1" w:sz="6"/>
+            </w:tcBorders>
+            <w:tcMar>
+              <w:top w:w="60" w:type="dxa"/>
+              <w:left w:w="60" w:type="dxa"/>
+              <w:bottom w:w="60" w:type="dxa"/>
+              <w:right w:w="60" w:type="dxa"/>
+            </w:tcMar>
+            <w:vAlign w:val="top"/>
+          </w:tcPr>
+          <w:p>
+            <w:pPr>
+              <w:pStyle w:val="Normal"/>
+              <w:suppressLineNumbers w:val="0"/>
+              <w:bidi w:val="0"/>
+              <w:spacing w:before="0" w:beforeAutospacing="off" w:after="150" w:afterAutospacing="off" w:line="279" w:lineRule="auto"/>
+              <w:ind w:left="0" w:right="0"/>
+              <w:jc w:val="center"/>
+              <w:rPr>
+                <w:rFonts w:ascii="Helvetica" w:hAnsi="Helvetica" w:eastAsia="Helvetica" w:cs="Helvetica"/>
+                <w:b w:val="0"/>
+                <w:bCs w:val="0"/>
+                <w:i w:val="0"/>
+                <w:iCs w:val="0"/>
+                <w:color w:val="000000" w:themeColor="text1" w:themeTint="FF" w:themeShade="FF"/>
+                <w:sz w:val="16"/>
+                <w:szCs w:val="16"/>
+              </w:rPr>
+            </w:pPr>
+            <w:r>
+              <w:rPr>
+                <w:rFonts w:ascii="Helvetica" w:hAnsi="Helvetica" w:eastAsia="Helvetica" w:cs="Helvetica"/>
+                <w:b w:val="0"/>
+                <w:bCs w:val="0"/>
+                <w:i w:val="0"/>
+                <w:iCs w:val="0"/>
+                <w:color w:val="000000" w:themeColor="text1" w:themeTint="FF" w:themeShade="FF"/>
+                <w:sz w:val="16"/>
+                <w:szCs w:val="16"/>
+              </w:rPr>
+              <w:t>2:10</w:t>
+            </w:r>
+            <w:r>
+              <w:rPr>
+                <w:rFonts w:ascii="Helvetica" w:hAnsi="Helvetica" w:eastAsia="Helvetica" w:cs="Helvetica"/>
+                <w:b w:val="0"/>
+                <w:bCs w:val="0"/>
+                <w:i w:val="0"/>
+                <w:iCs w:val="0"/>
+                <w:color w:val="000000" w:themeColor="text1" w:themeTint="FF" w:themeShade="FF"/>
+                <w:sz w:val="16"/>
+                <w:szCs w:val="16"/>
+              </w:rPr>
+              <w:t xml:space="preserve"> </w:t>
+            </w:r>
+            <w:r>
+              <w:rPr>
+                <w:rFonts w:ascii="Helvetica" w:hAnsi="Helvetica" w:eastAsia="Helvetica" w:cs="Helvetica"/>
+                <w:b w:val="0"/>
+                <w:bCs w:val="0"/>
+                <w:i w:val="0"/>
+                <w:iCs w:val="0"/>
+                <w:color w:val="000000" w:themeColor="text1" w:themeTint="FF" w:themeShade="FF"/>
+                <w:sz w:val="16"/>
+                <w:szCs w:val="16"/>
+              </w:rPr>
+              <w:t>pm</w:t>
+            </w:r>
+          </w:p>
+        </w:tc>
+        <w:tc>
+          <w:tcPr>
+            <w:tcW w:w="1305" w:type="dxa"/>
+            <w:tcBorders>
+              <w:top w:val="single" w:color="000000" w:themeColor="text1" w:sz="6"/>
+              <w:left w:val="single" w:color="000000" w:themeColor="text1" w:sz="6"/>
+              <w:bottom w:val="single" w:color="000000" w:themeColor="text1" w:sz="6"/>
+              <w:right w:val="single" w:color="000000" w:themeColor="text1" w:sz="6"/>
+            </w:tcBorders>
+            <w:tcMar>
+              <w:top w:w="60" w:type="dxa"/>
+              <w:left w:w="60" w:type="dxa"/>
+              <w:bottom w:w="60" w:type="dxa"/>
+              <w:right w:w="60" w:type="dxa"/>
+            </w:tcMar>
+            <w:vAlign w:val="top"/>
+          </w:tcPr>
+          <w:p>
+            <w:pPr>
+              <w:pStyle w:val="Normal"/>
+              <w:suppressLineNumbers w:val="0"/>
+              <w:bidi w:val="0"/>
+              <w:spacing w:before="0" w:beforeAutospacing="off" w:after="150" w:afterAutospacing="off" w:line="279" w:lineRule="auto"/>
+              <w:ind w:left="0" w:right="0"/>
+              <w:jc w:val="center"/>
+              <w:rPr>
+                <w:rFonts w:ascii="Helvetica" w:hAnsi="Helvetica" w:eastAsia="Helvetica" w:cs="Helvetica"/>
+                <w:b w:val="0"/>
+                <w:bCs w:val="0"/>
+                <w:i w:val="0"/>
+                <w:iCs w:val="0"/>
+                <w:color w:val="000000" w:themeColor="text1" w:themeTint="FF" w:themeShade="FF"/>
+                <w:sz w:val="16"/>
+                <w:szCs w:val="16"/>
+              </w:rPr>
+            </w:pPr>
+            <w:r>
+              <w:rPr>
+                <w:rFonts w:ascii="Helvetica" w:hAnsi="Helvetica" w:eastAsia="Helvetica" w:cs="Helvetica"/>
+                <w:b w:val="0"/>
+                <w:bCs w:val="0"/>
+                <w:i w:val="0"/>
+                <w:iCs w:val="0"/>
+                <w:color w:val="000000" w:themeColor="text1" w:themeTint="FF" w:themeShade="FF"/>
+                <w:sz w:val="16"/>
+                <w:szCs w:val="16"/>
+              </w:rPr>
+              <w:t>10 min</w:t>
+            </w:r>
+          </w:p>
+        </w:tc>
+      </w:tr>
+      <w:tr>
+        <w:trPr>
+          <w:trHeight w:val="150"/>
+        </w:trPr>
+        <w:tc>
+          <w:tcPr>
+            <w:tcW w:w="1530" w:type="dxa"/>
+            <w:tcBorders>
+              <w:top w:val="single" w:color="000000" w:themeColor="text1" w:sz="6"/>
+              <w:left w:val="single" w:color="000000" w:themeColor="text1" w:sz="6"/>
+              <w:bottom w:val="single" w:color="000000" w:themeColor="text1" w:sz="6"/>
+              <w:right w:val="single" w:color="000000" w:themeColor="text1" w:sz="6"/>
+            </w:tcBorders>
+            <w:tcMar>
+              <w:top w:w="60" w:type="dxa"/>
+              <w:left w:w="60" w:type="dxa"/>
+              <w:bottom w:w="60" w:type="dxa"/>
+              <w:right w:w="60" w:type="dxa"/>
+            </w:tcMar>
+            <w:vAlign w:val="top"/>
+          </w:tcPr>
+          <w:p>
+            <w:pPr>
+              <w:pStyle w:val="Normal"/>
+              <w:bidi w:val="0"/>
+              <w:spacing w:line="279" w:lineRule="auto"/>
+              <w:jc w:val="center"/>
+              <w:rPr>
+                <w:rFonts w:ascii="Helvetica" w:hAnsi="Helvetica" w:eastAsia="Helvetica" w:cs="Helvetica"/>
+                <w:b w:val="0"/>
+                <w:bCs w:val="0"/>
+                <w:i w:val="0"/>
+                <w:iCs w:val="0"/>
+                <w:color w:val="000000" w:themeColor="text1" w:themeTint="FF" w:themeShade="FF"/>
+                <w:sz w:val="16"/>
+                <w:szCs w:val="16"/>
+              </w:rPr>
+            </w:pPr>
+          </w:p>
+        </w:tc>
+        <w:tc>
+          <w:tcPr>
+            <w:tcW w:w="1500" w:type="dxa"/>
+            <w:tcBorders>
+              <w:top w:val="single" w:color="000000" w:themeColor="text1" w:sz="6"/>
+              <w:left w:val="single" w:color="000000" w:themeColor="text1" w:sz="6"/>
+              <w:bottom w:val="single" w:color="000000" w:themeColor="text1" w:sz="6"/>
+              <w:right w:val="single" w:color="000000" w:themeColor="text1" w:sz="6"/>
+            </w:tcBorders>
+            <w:tcMar>
+              <w:top w:w="60" w:type="dxa"/>
+              <w:left w:w="60" w:type="dxa"/>
+              <w:bottom w:w="60" w:type="dxa"/>
+              <w:right w:w="60" w:type="dxa"/>
+            </w:tcMar>
+            <w:vAlign w:val="top"/>
+          </w:tcPr>
+          <w:p>
+            <w:pPr>
+              <w:pStyle w:val="Normal"/>
+              <w:bidi w:val="0"/>
+              <w:spacing w:line="279" w:lineRule="auto"/>
+              <w:jc w:val="center"/>
+              <w:rPr>
+                <w:rFonts w:ascii="Helvetica" w:hAnsi="Helvetica" w:eastAsia="Helvetica" w:cs="Helvetica"/>
+                <w:b w:val="0"/>
+                <w:bCs w:val="0"/>
+                <w:i w:val="0"/>
+                <w:iCs w:val="0"/>
+                <w:color w:val="000000" w:themeColor="text1" w:themeTint="FF" w:themeShade="FF"/>
+                <w:sz w:val="16"/>
+                <w:szCs w:val="16"/>
+              </w:rPr>
+            </w:pPr>
+          </w:p>
+        </w:tc>
+        <w:tc>
+          <w:tcPr>
+            <w:tcW w:w="1155" w:type="dxa"/>
+            <w:tcBorders>
+              <w:top w:val="single" w:color="000000" w:themeColor="text1" w:sz="6"/>
+              <w:left w:val="single" w:color="000000" w:themeColor="text1" w:sz="6"/>
+              <w:bottom w:val="single" w:color="000000" w:themeColor="text1" w:sz="6"/>
+              <w:right w:val="single" w:color="000000" w:themeColor="text1" w:sz="6"/>
+            </w:tcBorders>
+            <w:tcMar>
+              <w:top w:w="60" w:type="dxa"/>
+              <w:left w:w="60" w:type="dxa"/>
+              <w:bottom w:w="60" w:type="dxa"/>
+              <w:right w:w="60" w:type="dxa"/>
+            </w:tcMar>
+            <w:vAlign w:val="top"/>
+          </w:tcPr>
+          <w:p>
+            <w:pPr>
+              <w:pStyle w:val="Normal"/>
+              <w:bidi w:val="0"/>
+              <w:spacing w:line="279" w:lineRule="auto"/>
+              <w:jc w:val="center"/>
+              <w:rPr>
+                <w:rFonts w:ascii="Helvetica" w:hAnsi="Helvetica" w:eastAsia="Helvetica" w:cs="Helvetica"/>
+                <w:b w:val="0"/>
+                <w:bCs w:val="0"/>
+                <w:i w:val="0"/>
+                <w:iCs w:val="0"/>
+                <w:color w:val="000000" w:themeColor="text1" w:themeTint="FF" w:themeShade="FF"/>
+                <w:sz w:val="16"/>
+                <w:szCs w:val="16"/>
+              </w:rPr>
+            </w:pPr>
+          </w:p>
+        </w:tc>
+        <w:tc>
+          <w:tcPr>
+            <w:tcW w:w="1305" w:type="dxa"/>
+            <w:tcBorders>
+              <w:top w:val="single" w:color="000000" w:themeColor="text1" w:sz="6"/>
+              <w:left w:val="single" w:color="000000" w:themeColor="text1" w:sz="6"/>
+              <w:bottom w:val="single" w:color="000000" w:themeColor="text1" w:sz="6"/>
+              <w:right w:val="single" w:color="000000" w:themeColor="text1" w:sz="6"/>
+            </w:tcBorders>
+            <w:tcMar>
+              <w:top w:w="60" w:type="dxa"/>
+              <w:left w:w="60" w:type="dxa"/>
+              <w:bottom w:w="60" w:type="dxa"/>
+              <w:right w:w="60" w:type="dxa"/>
+            </w:tcMar>
+            <w:vAlign w:val="top"/>
+          </w:tcPr>
+          <w:p>
+            <w:pPr>
+              <w:pStyle w:val="Normal"/>
+              <w:bidi w:val="0"/>
+              <w:spacing w:line="279" w:lineRule="auto"/>
+              <w:jc w:val="center"/>
+              <w:rPr>
+                <w:rFonts w:ascii="Helvetica" w:hAnsi="Helvetica" w:eastAsia="Helvetica" w:cs="Helvetica"/>
+                <w:b w:val="0"/>
+                <w:bCs w:val="0"/>
+                <w:i w:val="0"/>
+                <w:iCs w:val="0"/>
+                <w:color w:val="000000" w:themeColor="text1" w:themeTint="FF" w:themeShade="FF"/>
+                <w:sz w:val="16"/>
+                <w:szCs w:val="16"/>
+              </w:rPr>
+            </w:pPr>
+          </w:p>
+        </w:tc>
+        <w:tc>
+          <w:tcPr>
+            <w:tcW w:w="1380" w:type="dxa"/>
+            <w:tcBorders>
+              <w:top w:val="single" w:color="000000" w:themeColor="text1" w:sz="6"/>
+              <w:left w:val="single" w:color="000000" w:themeColor="text1" w:sz="6"/>
+              <w:bottom w:val="single" w:color="000000" w:themeColor="text1" w:sz="6"/>
+              <w:right w:val="single" w:color="000000" w:themeColor="text1" w:sz="6"/>
+            </w:tcBorders>
+            <w:tcMar>
+              <w:top w:w="60" w:type="dxa"/>
+              <w:left w:w="60" w:type="dxa"/>
+              <w:bottom w:w="60" w:type="dxa"/>
+              <w:right w:w="60" w:type="dxa"/>
+            </w:tcMar>
+            <w:vAlign w:val="top"/>
+          </w:tcPr>
+          <w:p>
+            <w:pPr>
+              <w:pStyle w:val="Normal"/>
+              <w:bidi w:val="0"/>
+              <w:spacing w:line="279" w:lineRule="auto"/>
+              <w:jc w:val="center"/>
+              <w:rPr>
+                <w:rFonts w:ascii="Helvetica" w:hAnsi="Helvetica" w:eastAsia="Helvetica" w:cs="Helvetica"/>
+                <w:b w:val="0"/>
+                <w:bCs w:val="0"/>
+                <w:i w:val="0"/>
+                <w:iCs w:val="0"/>
+                <w:color w:val="000000" w:themeColor="text1" w:themeTint="FF" w:themeShade="FF"/>
+                <w:sz w:val="16"/>
+                <w:szCs w:val="16"/>
+              </w:rPr>
+            </w:pPr>
+          </w:p>
+        </w:tc>
+        <w:tc>
+          <w:tcPr>
+            <w:tcW w:w="1305" w:type="dxa"/>
+            <w:tcBorders>
+              <w:top w:val="single" w:color="000000" w:themeColor="text1" w:sz="6"/>
+              <w:left w:val="single" w:color="000000" w:themeColor="text1" w:sz="6"/>
+              <w:bottom w:val="single" w:color="000000" w:themeColor="text1" w:sz="6"/>
+              <w:right w:val="single" w:color="000000" w:themeColor="text1" w:sz="6"/>
+            </w:tcBorders>
+            <w:tcMar>
+              <w:top w:w="60" w:type="dxa"/>
+              <w:left w:w="60" w:type="dxa"/>
+              <w:bottom w:w="60" w:type="dxa"/>
+              <w:right w:w="60" w:type="dxa"/>
+            </w:tcMar>
+            <w:vAlign w:val="top"/>
+          </w:tcPr>
+          <w:p>
+            <w:pPr>
+              <w:pStyle w:val="Normal"/>
+              <w:suppressLineNumbers w:val="0"/>
+              <w:bidi w:val="0"/>
+              <w:spacing w:before="0" w:beforeAutospacing="off" w:after="150" w:afterAutospacing="off" w:line="279" w:lineRule="auto"/>
+              <w:ind w:left="0" w:right="0"/>
+              <w:jc w:val="center"/>
+              <w:rPr>
+                <w:rFonts w:ascii="Helvetica" w:hAnsi="Helvetica" w:eastAsia="Helvetica" w:cs="Helvetica"/>
+                <w:b w:val="0"/>
+                <w:bCs w:val="0"/>
+                <w:i w:val="0"/>
+                <w:iCs w:val="0"/>
+                <w:color w:val="000000" w:themeColor="text1" w:themeTint="FF" w:themeShade="FF"/>
+                <w:sz w:val="16"/>
+                <w:szCs w:val="16"/>
+              </w:rPr>
+            </w:pPr>
+            <w:r>
+              <w:rPr>
+                <w:rFonts w:ascii="Helvetica" w:hAnsi="Helvetica" w:eastAsia="Helvetica" w:cs="Helvetica"/>
+                <w:b w:val="0"/>
+                <w:bCs w:val="0"/>
+                <w:i w:val="0"/>
+                <w:iCs w:val="0"/>
+                <w:color w:val="000000" w:themeColor="text1" w:themeTint="FF" w:themeShade="FF"/>
+                <w:sz w:val="16"/>
+                <w:szCs w:val="16"/>
+              </w:rPr>
+              <w:t xml:space="preserve">Week2 total: </w:t>
+            </w:r>
+          </w:p>
+          <w:p>
+            <w:pPr>
+              <w:pStyle w:val="Normal"/>
+              <w:suppressLineNumbers w:val="0"/>
+              <w:bidi w:val="0"/>
+              <w:spacing w:before="0" w:beforeAutospacing="off" w:after="150" w:afterAutospacing="off" w:line="279" w:lineRule="auto"/>
+              <w:ind w:left="0" w:right="0"/>
+              <w:jc w:val="center"/>
+              <w:rPr>
+                <w:rFonts w:ascii="Helvetica" w:hAnsi="Helvetica" w:eastAsia="Helvetica" w:cs="Helvetica"/>
+                <w:b w:val="0"/>
+                <w:bCs w:val="0"/>
+                <w:i w:val="0"/>
+                <w:iCs w:val="0"/>
+                <w:color w:val="000000" w:themeColor="text1" w:themeTint="FF" w:themeShade="FF"/>
+                <w:sz w:val="16"/>
+                <w:szCs w:val="16"/>
+              </w:rPr>
+            </w:pPr>
+            <w:r>
+              <w:rPr>
+                <w:rFonts w:ascii="Helvetica" w:hAnsi="Helvetica" w:eastAsia="Helvetica" w:cs="Helvetica"/>
+                <w:b w:val="0"/>
+                <w:bCs w:val="0"/>
+                <w:i w:val="0"/>
+                <w:iCs w:val="0"/>
+                <w:color w:val="000000" w:themeColor="text1" w:themeTint="FF" w:themeShade="FF"/>
+                <w:sz w:val="16"/>
+                <w:szCs w:val="16"/>
+              </w:rPr>
+              <w:t xml:space="preserve">120 </w:t>
+            </w:r>
+            <w:r>
+              <w:rPr>
+                <w:rFonts w:ascii="Helvetica" w:hAnsi="Helvetica" w:eastAsia="Helvetica" w:cs="Helvetica"/>
+                <w:b w:val="0"/>
+                <w:bCs w:val="0"/>
+                <w:i w:val="0"/>
+                <w:iCs w:val="0"/>
+                <w:color w:val="000000" w:themeColor="text1" w:themeTint="FF" w:themeShade="FF"/>
+                <w:sz w:val="16"/>
+                <w:szCs w:val="16"/>
+              </w:rPr>
+              <w:t>min</w:t>
+            </w:r>
+          </w:p>
+          <w:p>
+            <w:pPr>
+              <w:pStyle w:val="Normal"/>
+              <w:bidi w:val="0"/>
+              <w:spacing w:line="279" w:lineRule="auto"/>
+              <w:jc w:val="center"/>
+              <w:rPr>
+                <w:rFonts w:ascii="Helvetica" w:hAnsi="Helvetica" w:eastAsia="Helvetica" w:cs="Helvetica"/>
+                <w:b w:val="0"/>
+                <w:bCs w:val="0"/>
+                <w:i w:val="0"/>
+                <w:iCs w:val="0"/>
+                <w:color w:val="000000" w:themeColor="text1" w:themeTint="FF" w:themeShade="FF"/>
+                <w:sz w:val="16"/>
+                <w:szCs w:val="16"/>
+              </w:rPr>
+            </w:pPr>
+          </w:p>
+        </w:tc>
+      </w:tr>
+      <w:tr>
+        <w:trPr>
+          <w:trHeight w:val="150"/>
+        </w:trPr>
+        <w:tc>
+          <w:tcPr>
+            <w:tcW w:w="1530" w:type="dxa"/>
+            <w:tcBorders>
+              <w:top w:val="single" w:color="000000" w:themeColor="text1" w:sz="6"/>
+              <w:left w:val="single" w:color="000000" w:themeColor="text1" w:sz="6"/>
+              <w:bottom w:val="single" w:color="000000" w:themeColor="text1" w:sz="6"/>
+              <w:right w:val="single" w:color="000000" w:themeColor="text1" w:sz="6"/>
+            </w:tcBorders>
+            <w:tcMar>
+              <w:top w:w="60" w:type="dxa"/>
+              <w:left w:w="60" w:type="dxa"/>
+              <w:bottom w:w="60" w:type="dxa"/>
+              <w:right w:w="60" w:type="dxa"/>
+            </w:tcMar>
+            <w:vAlign w:val="top"/>
+          </w:tcPr>
+          <w:p>
+            <w:pPr>
+              <w:bidi w:val="0"/>
+              <w:spacing w:before="0" w:beforeAutospacing="off" w:after="150" w:afterAutospacing="off"/>
+              <w:jc w:val="center"/>
+            </w:pPr>
+            <w:r>
+              <w:rPr>
+                <w:rFonts w:ascii="Calibri" w:hAnsi="Calibri" w:eastAsia="Calibri" w:cs="Calibri"/>
+                <w:b w:val="0"/>
+                <w:bCs w:val="0"/>
+                <w:i w:val="0"/>
+                <w:iCs w:val="0"/>
+                <w:noProof w:val="0"/>
+                <w:color w:val="000000" w:themeColor="text1" w:themeTint="FF" w:themeShade="FF"/>
+                <w:sz w:val="16"/>
+                <w:szCs w:val="16"/>
+                <w:lang w:val="en-US"/>
+              </w:rPr>
+              <w:t>Week 3: 09/29/26-10/04/26</w:t>
+            </w:r>
+          </w:p>
+          <w:p>
+            <w:pPr>
+              <w:pStyle w:val="Normal"/>
+              <w:bidi w:val="0"/>
+              <w:spacing w:line="279" w:lineRule="auto"/>
+              <w:jc w:val="center"/>
+              <w:rPr>
+                <w:rFonts w:ascii="Helvetica" w:hAnsi="Helvetica" w:eastAsia="Helvetica" w:cs="Helvetica"/>
+                <w:b w:val="0"/>
+                <w:bCs w:val="0"/>
+                <w:i w:val="0"/>
+                <w:iCs w:val="0"/>
+                <w:color w:val="000000" w:themeColor="text1" w:themeTint="FF" w:themeShade="FF"/>
+                <w:sz w:val="16"/>
+                <w:szCs w:val="16"/>
+              </w:rPr>
+            </w:pPr>
+          </w:p>
+        </w:tc>
+        <w:tc>
+          <w:tcPr>
+            <w:tcW w:w="1500" w:type="dxa"/>
+            <w:tcBorders>
+              <w:top w:val="single" w:color="000000" w:themeColor="text1" w:sz="6"/>
+              <w:left w:val="single" w:color="000000" w:themeColor="text1" w:sz="6"/>
+              <w:bottom w:val="single" w:color="000000" w:themeColor="text1" w:sz="6"/>
+              <w:right w:val="single" w:color="000000" w:themeColor="text1" w:sz="6"/>
+            </w:tcBorders>
+            <w:tcMar>
+              <w:top w:w="60" w:type="dxa"/>
+              <w:left w:w="60" w:type="dxa"/>
+              <w:bottom w:w="60" w:type="dxa"/>
+              <w:right w:w="60" w:type="dxa"/>
+            </w:tcMar>
+            <w:vAlign w:val="top"/>
+          </w:tcPr>
+          <w:p>
+            <w:pPr>
+              <w:bidi w:val="0"/>
               <w:spacing w:before="0" w:beforeAutospacing="off" w:after="0" w:afterAutospacing="off"/>
+              <w:jc w:val="center"/>
+            </w:pPr>
+            <w:r>
+              <w:rPr>
+                <w:rFonts w:ascii="Calibri" w:hAnsi="Calibri" w:eastAsia="Calibri" w:cs="Calibri"/>
+                <w:b w:val="0"/>
+                <w:bCs w:val="0"/>
+                <w:i w:val="0"/>
+                <w:iCs w:val="0"/>
+                <w:noProof w:val="0"/>
+                <w:color w:val="000000" w:themeColor="text1" w:themeTint="FF" w:themeShade="FF"/>
+                <w:sz w:val="16"/>
+                <w:szCs w:val="16"/>
+                <w:lang w:val="en-US"/>
+              </w:rPr>
+              <w:t>Group meeting</w:t>
+            </w:r>
+          </w:p>
+          <w:p>
+            <w:pPr>
+              <w:pStyle w:val="Normal"/>
+              <w:bidi w:val="0"/>
+              <w:spacing w:line="279" w:lineRule="auto"/>
+              <w:jc w:val="center"/>
+              <w:rPr>
+                <w:rFonts w:ascii="Helvetica" w:hAnsi="Helvetica" w:eastAsia="Helvetica" w:cs="Helvetica"/>
+                <w:b w:val="0"/>
+                <w:bCs w:val="0"/>
+                <w:i w:val="0"/>
+                <w:iCs w:val="0"/>
+                <w:color w:val="000000" w:themeColor="text1" w:themeTint="FF" w:themeShade="FF"/>
+                <w:sz w:val="16"/>
+                <w:szCs w:val="16"/>
+              </w:rPr>
+            </w:pPr>
+          </w:p>
+        </w:tc>
+        <w:tc>
+          <w:tcPr>
+            <w:tcW w:w="1155" w:type="dxa"/>
+            <w:tcBorders>
+              <w:top w:val="single" w:color="000000" w:themeColor="text1" w:sz="6"/>
+              <w:left w:val="single" w:color="000000" w:themeColor="text1" w:sz="6"/>
+              <w:bottom w:val="single" w:color="000000" w:themeColor="text1" w:sz="6"/>
+              <w:right w:val="single" w:color="000000" w:themeColor="text1" w:sz="6"/>
+            </w:tcBorders>
+            <w:tcMar>
+              <w:top w:w="60" w:type="dxa"/>
+              <w:left w:w="60" w:type="dxa"/>
+              <w:bottom w:w="60" w:type="dxa"/>
+              <w:right w:w="60" w:type="dxa"/>
+            </w:tcMar>
+            <w:vAlign w:val="top"/>
+          </w:tcPr>
+          <w:p>
+            <w:pPr>
+              <w:bidi w:val="0"/>
+              <w:spacing w:before="0" w:beforeAutospacing="off" w:after="0" w:afterAutospacing="off"/>
+              <w:jc w:val="center"/>
+            </w:pPr>
+            <w:r>
+              <w:rPr>
+                <w:rFonts w:ascii="Calibri" w:hAnsi="Calibri" w:eastAsia="Calibri" w:cs="Calibri"/>
+                <w:b w:val="0"/>
+                <w:bCs w:val="0"/>
+                <w:i w:val="0"/>
+                <w:iCs w:val="0"/>
+                <w:noProof w:val="0"/>
+                <w:color w:val="000000" w:themeColor="text1" w:themeTint="FF" w:themeShade="FF"/>
+                <w:sz w:val="16"/>
+                <w:szCs w:val="16"/>
+                <w:lang w:val="en-US"/>
+              </w:rPr>
+              <w:t>10/01/26</w:t>
+            </w:r>
+          </w:p>
+          <w:p>
+            <w:pPr>
+              <w:pStyle w:val="Normal"/>
+              <w:bidi w:val="0"/>
+              <w:spacing w:line="279" w:lineRule="auto"/>
+              <w:jc w:val="center"/>
+              <w:rPr>
+                <w:rFonts w:ascii="Helvetica" w:hAnsi="Helvetica" w:eastAsia="Helvetica" w:cs="Helvetica"/>
+                <w:b w:val="0"/>
+                <w:bCs w:val="0"/>
+                <w:i w:val="0"/>
+                <w:iCs w:val="0"/>
+                <w:color w:val="000000" w:themeColor="text1" w:themeTint="FF" w:themeShade="FF"/>
+                <w:sz w:val="16"/>
+                <w:szCs w:val="16"/>
+              </w:rPr>
+            </w:pPr>
+          </w:p>
+        </w:tc>
+        <w:tc>
+          <w:tcPr>
+            <w:tcW w:w="1305" w:type="dxa"/>
+            <w:tcBorders>
+              <w:top w:val="single" w:color="000000" w:themeColor="text1" w:sz="6"/>
+              <w:left w:val="single" w:color="000000" w:themeColor="text1" w:sz="6"/>
+              <w:bottom w:val="single" w:color="000000" w:themeColor="text1" w:sz="6"/>
+              <w:right w:val="single" w:color="000000" w:themeColor="text1" w:sz="6"/>
+            </w:tcBorders>
+            <w:tcMar>
+              <w:top w:w="60" w:type="dxa"/>
+              <w:left w:w="60" w:type="dxa"/>
+              <w:bottom w:w="60" w:type="dxa"/>
+              <w:right w:w="60" w:type="dxa"/>
+            </w:tcMar>
+            <w:vAlign w:val="top"/>
+          </w:tcPr>
+          <w:p>
+            <w:pPr>
+              <w:bidi w:val="0"/>
+              <w:spacing w:before="0" w:beforeAutospacing="off" w:after="0" w:afterAutospacing="off"/>
+              <w:jc w:val="center"/>
+            </w:pPr>
+            <w:r>
+              <w:rPr>
+                <w:rFonts w:ascii="Calibri" w:hAnsi="Calibri" w:eastAsia="Calibri" w:cs="Calibri"/>
+                <w:b w:val="0"/>
+                <w:bCs w:val="0"/>
+                <w:i w:val="0"/>
+                <w:iCs w:val="0"/>
+                <w:noProof w:val="0"/>
+                <w:color w:val="000000" w:themeColor="text1" w:themeTint="FF" w:themeShade="FF"/>
+                <w:sz w:val="16"/>
+                <w:szCs w:val="16"/>
+                <w:lang w:val="en-US"/>
+              </w:rPr>
+              <w:t>2:30pm</w:t>
+            </w:r>
+          </w:p>
+          <w:p>
+            <w:pPr>
+              <w:pStyle w:val="Normal"/>
+              <w:bidi w:val="0"/>
+              <w:spacing w:line="279" w:lineRule="auto"/>
+              <w:jc w:val="center"/>
+              <w:rPr>
+                <w:rFonts w:ascii="Helvetica" w:hAnsi="Helvetica" w:eastAsia="Helvetica" w:cs="Helvetica"/>
+                <w:b w:val="0"/>
+                <w:bCs w:val="0"/>
+                <w:i w:val="0"/>
+                <w:iCs w:val="0"/>
+                <w:color w:val="000000" w:themeColor="text1" w:themeTint="FF" w:themeShade="FF"/>
+                <w:sz w:val="16"/>
+                <w:szCs w:val="16"/>
+              </w:rPr>
+            </w:pPr>
+          </w:p>
+        </w:tc>
+        <w:tc>
+          <w:tcPr>
+            <w:tcW w:w="1380" w:type="dxa"/>
+            <w:tcBorders>
+              <w:top w:val="single" w:color="000000" w:themeColor="text1" w:sz="6"/>
+              <w:left w:val="single" w:color="000000" w:themeColor="text1" w:sz="6"/>
+              <w:bottom w:val="single" w:color="000000" w:themeColor="text1" w:sz="6"/>
+              <w:right w:val="single" w:color="000000" w:themeColor="text1" w:sz="6"/>
+            </w:tcBorders>
+            <w:tcMar>
+              <w:top w:w="60" w:type="dxa"/>
+              <w:left w:w="60" w:type="dxa"/>
+              <w:bottom w:w="60" w:type="dxa"/>
+              <w:right w:w="60" w:type="dxa"/>
+            </w:tcMar>
+            <w:vAlign w:val="top"/>
+          </w:tcPr>
+          <w:p>
+            <w:pPr>
+              <w:bidi w:val="0"/>
+              <w:spacing w:before="0" w:beforeAutospacing="off" w:after="0" w:afterAutospacing="off"/>
+              <w:jc w:val="center"/>
+            </w:pPr>
+            <w:r>
+              <w:rPr>
+                <w:rFonts w:ascii="Calibri" w:hAnsi="Calibri" w:eastAsia="Calibri" w:cs="Calibri"/>
+                <w:b w:val="0"/>
+                <w:bCs w:val="0"/>
+                <w:i w:val="0"/>
+                <w:iCs w:val="0"/>
+                <w:noProof w:val="0"/>
+                <w:color w:val="000000" w:themeColor="text1" w:themeTint="FF" w:themeShade="FF"/>
+                <w:sz w:val="16"/>
+                <w:szCs w:val="16"/>
+                <w:lang w:val="en-US"/>
+              </w:rPr>
+              <w:t>3pm</w:t>
+            </w:r>
+          </w:p>
+          <w:p>
+            <w:pPr>
+              <w:pStyle w:val="Normal"/>
+              <w:bidi w:val="0"/>
+              <w:spacing w:line="279" w:lineRule="auto"/>
+              <w:jc w:val="center"/>
+              <w:rPr>
+                <w:rFonts w:ascii="Helvetica" w:hAnsi="Helvetica" w:eastAsia="Helvetica" w:cs="Helvetica"/>
+                <w:b w:val="0"/>
+                <w:bCs w:val="0"/>
+                <w:i w:val="0"/>
+                <w:iCs w:val="0"/>
+                <w:color w:val="000000" w:themeColor="text1" w:themeTint="FF" w:themeShade="FF"/>
+                <w:sz w:val="16"/>
+                <w:szCs w:val="16"/>
+              </w:rPr>
+            </w:pPr>
+          </w:p>
+        </w:tc>
+        <w:tc>
+          <w:tcPr>
+            <w:tcW w:w="1305" w:type="dxa"/>
+            <w:tcBorders>
+              <w:top w:val="single" w:color="000000" w:themeColor="text1" w:sz="6"/>
+              <w:left w:val="single" w:color="000000" w:themeColor="text1" w:sz="6"/>
+              <w:bottom w:val="single" w:color="000000" w:themeColor="text1" w:sz="6"/>
+              <w:right w:val="single" w:color="000000" w:themeColor="text1" w:sz="6"/>
+            </w:tcBorders>
+            <w:tcMar>
+              <w:top w:w="60" w:type="dxa"/>
+              <w:left w:w="60" w:type="dxa"/>
+              <w:bottom w:w="60" w:type="dxa"/>
+              <w:right w:w="60" w:type="dxa"/>
+            </w:tcMar>
+            <w:vAlign w:val="top"/>
+          </w:tcPr>
+          <w:p>
+            <w:pPr>
+              <w:bidi w:val="0"/>
+              <w:spacing w:before="0" w:beforeAutospacing="off" w:after="0" w:afterAutospacing="off"/>
+              <w:jc w:val="center"/>
+            </w:pPr>
+            <w:r>
+              <w:rPr>
+                <w:rFonts w:ascii="Calibri" w:hAnsi="Calibri" w:eastAsia="Calibri" w:cs="Calibri"/>
+                <w:b w:val="0"/>
+                <w:bCs w:val="0"/>
+                <w:i w:val="0"/>
+                <w:iCs w:val="0"/>
+                <w:noProof w:val="0"/>
+                <w:color w:val="000000" w:themeColor="text1" w:themeTint="FF" w:themeShade="FF"/>
+                <w:sz w:val="16"/>
+                <w:szCs w:val="16"/>
+                <w:lang w:val="en-US"/>
+              </w:rPr>
+              <w:t>30min</w:t>
+            </w:r>
+          </w:p>
+          <w:p>
+            <w:pPr>
+              <w:pStyle w:val="Normal"/>
+              <w:bidi w:val="0"/>
+              <w:spacing w:line="279" w:lineRule="auto"/>
+              <w:jc w:val="center"/>
+              <w:rPr>
+                <w:rFonts w:ascii="Helvetica" w:hAnsi="Helvetica" w:eastAsia="Helvetica" w:cs="Helvetica"/>
+                <w:b w:val="0"/>
+                <w:bCs w:val="0"/>
+                <w:i w:val="0"/>
+                <w:iCs w:val="0"/>
+                <w:color w:val="000000" w:themeColor="text1" w:themeTint="FF" w:themeShade="FF"/>
+                <w:sz w:val="16"/>
+                <w:szCs w:val="16"/>
+              </w:rPr>
+            </w:pPr>
+          </w:p>
+        </w:tc>
+      </w:tr>
+      <w:tr>
+        <w:trPr>
+          <w:trHeight w:val="150"/>
+        </w:trPr>
+        <w:tc>
+          <w:tcPr>
+            <w:tcW w:w="1530" w:type="dxa"/>
+            <w:tcBorders>
+              <w:top w:val="single" w:color="000000" w:themeColor="text1" w:sz="6"/>
+              <w:left w:val="single" w:color="000000" w:themeColor="text1" w:sz="6"/>
+              <w:bottom w:val="single" w:color="000000" w:themeColor="text1" w:sz="6"/>
+              <w:right w:val="single" w:color="000000" w:themeColor="text1" w:sz="6"/>
+            </w:tcBorders>
+            <w:tcMar>
+              <w:top w:w="60" w:type="dxa"/>
+              <w:left w:w="60" w:type="dxa"/>
+              <w:bottom w:w="60" w:type="dxa"/>
+              <w:right w:w="60" w:type="dxa"/>
+            </w:tcMar>
+            <w:vAlign w:val="top"/>
+          </w:tcPr>
+          <w:p>
+            <w:pPr>
+              <w:pStyle w:val="Normal"/>
+              <w:bidi w:val="0"/>
+              <w:jc w:val="center"/>
+              <w:rPr>
+                <w:rFonts w:ascii="Calibri" w:hAnsi="Calibri" w:eastAsia="Calibri" w:cs="Calibri"/>
+                <w:b w:val="0"/>
+                <w:bCs w:val="0"/>
+                <w:i w:val="0"/>
+                <w:iCs w:val="0"/>
+                <w:noProof w:val="0"/>
+                <w:color w:val="000000" w:themeColor="text1" w:themeTint="FF" w:themeShade="FF"/>
+                <w:sz w:val="16"/>
+                <w:szCs w:val="16"/>
+                <w:lang w:val="en-US"/>
+              </w:rPr>
             </w:pPr>
           </w:p>
         </w:tc>
@@ -1791,7 +3723,43 @@
           </w:tcPr>
           <w:p>
             <w:pPr>
+              <w:bidi w:val="0"/>
               <w:spacing w:before="0" w:beforeAutospacing="off" w:after="0" w:afterAutospacing="off"/>
+              <w:jc w:val="center"/>
+            </w:pPr>
+            <w:r>
+              <w:rPr>
+                <w:rFonts w:ascii="Calibri" w:hAnsi="Calibri" w:eastAsia="Calibri" w:cs="Calibri"/>
+                <w:b w:val="0"/>
+                <w:bCs w:val="0"/>
+                <w:i w:val="0"/>
+                <w:iCs w:val="0"/>
+                <w:noProof w:val="0"/>
+                <w:color w:val="000000" w:themeColor="text1" w:themeTint="FF" w:themeShade="FF"/>
+                <w:sz w:val="16"/>
+                <w:szCs w:val="16"/>
+                <w:lang w:val="en-US"/>
+              </w:rPr>
+              <w:t>Class Diagram and Class Descriptions</w:t>
+            </w:r>
+          </w:p>
+          <w:p>
+            <w:pPr>
+              <w:pStyle w:val="Normal"/>
+              <w:bidi w:val="0"/>
+              <w:jc w:val="center"/>
+              <w:rPr>
+                <w:rFonts w:ascii="Calibri" w:hAnsi="Calibri" w:eastAsia="Calibri" w:cs="Calibri"/>
+                <w:b w:val="0"/>
+                <w:bCs w:val="0"/>
+                <w:i w:val="0"/>
+                <w:iCs w:val="0"/>
+                <w:noProof w:val="0"/>
+                <w:color w:val="000000" w:themeColor="text1" w:themeTint="FF" w:themeShade="FF"/>
+                <w:sz w:val="16"/>
+                <w:szCs w:val="16"/>
+                <w:lang w:val="en-US"/>
+              </w:rPr>
             </w:pPr>
           </w:p>
         </w:tc>
@@ -1814,7 +3782,43 @@
           </w:tcPr>
           <w:p>
             <w:pPr>
+              <w:bidi w:val="0"/>
               <w:spacing w:before="0" w:beforeAutospacing="off" w:after="0" w:afterAutospacing="off"/>
+              <w:jc w:val="center"/>
+            </w:pPr>
+            <w:r>
+              <w:rPr>
+                <w:rFonts w:ascii="Calibri" w:hAnsi="Calibri" w:eastAsia="Calibri" w:cs="Calibri"/>
+                <w:b w:val="0"/>
+                <w:bCs w:val="0"/>
+                <w:i w:val="0"/>
+                <w:iCs w:val="0"/>
+                <w:noProof w:val="0"/>
+                <w:color w:val="000000" w:themeColor="text1" w:themeTint="FF" w:themeShade="FF"/>
+                <w:sz w:val="16"/>
+                <w:szCs w:val="16"/>
+                <w:lang w:val="en-US"/>
+              </w:rPr>
+              <w:t>10/04/26</w:t>
+            </w:r>
+          </w:p>
+          <w:p>
+            <w:pPr>
+              <w:pStyle w:val="Normal"/>
+              <w:bidi w:val="0"/>
+              <w:jc w:val="center"/>
+              <w:rPr>
+                <w:rFonts w:ascii="Calibri" w:hAnsi="Calibri" w:eastAsia="Calibri" w:cs="Calibri"/>
+                <w:b w:val="0"/>
+                <w:bCs w:val="0"/>
+                <w:i w:val="0"/>
+                <w:iCs w:val="0"/>
+                <w:noProof w:val="0"/>
+                <w:color w:val="000000" w:themeColor="text1" w:themeTint="FF" w:themeShade="FF"/>
+                <w:sz w:val="16"/>
+                <w:szCs w:val="16"/>
+                <w:lang w:val="en-US"/>
+              </w:rPr>
             </w:pPr>
           </w:p>
         </w:tc>
@@ -1837,8 +3841,25 @@
           </w:tcPr>
           <w:p>
             <w:pPr>
-              <w:spacing w:before="0" w:beforeAutospacing="off" w:after="0" w:afterAutospacing="off"/>
-            </w:pPr>
+              <w:pStyle w:val="Normal"/>
+              <w:bidi w:val="0"/>
+              <w:jc w:val="center"/>
+            </w:pPr>
+            <w:r>
+              <w:rPr>
+                <w:rFonts w:ascii="Calibri" w:hAnsi="Calibri" w:eastAsia="Calibri" w:cs="Calibri"/>
+                <w:b w:val="0"/>
+                <w:bCs w:val="0"/>
+                <w:i w:val="0"/>
+                <w:iCs w:val="0"/>
+                <w:noProof w:val="0"/>
+                <w:color w:val="000000" w:themeColor="text1" w:themeTint="FF" w:themeShade="FF"/>
+                <w:sz w:val="16"/>
+                <w:szCs w:val="16"/>
+                <w:lang w:val="en-US"/>
+              </w:rPr>
+              <w:t>11 am</w:t>
+            </w:r>
           </w:p>
         </w:tc>
         <w:tc>
@@ -1860,8 +3881,25 @@
           </w:tcPr>
           <w:p>
             <w:pPr>
-              <w:spacing w:before="0" w:beforeAutospacing="off" w:after="0" w:afterAutospacing="off"/>
-            </w:pPr>
+              <w:pStyle w:val="Normal"/>
+              <w:bidi w:val="0"/>
+              <w:jc w:val="center"/>
+            </w:pPr>
+            <w:r>
+              <w:rPr>
+                <w:rFonts w:ascii="Calibri" w:hAnsi="Calibri" w:eastAsia="Calibri" w:cs="Calibri"/>
+                <w:b w:val="0"/>
+                <w:bCs w:val="0"/>
+                <w:i w:val="0"/>
+                <w:iCs w:val="0"/>
+                <w:noProof w:val="0"/>
+                <w:color w:val="000000" w:themeColor="text1" w:themeTint="FF" w:themeShade="FF"/>
+                <w:sz w:val="16"/>
+                <w:szCs w:val="16"/>
+                <w:lang w:val="en-US"/>
+              </w:rPr>
+              <w:t>12:40 pm</w:t>
+            </w:r>
           </w:p>
         </w:tc>
         <w:tc>
@@ -1883,13 +3921,757 @@
           </w:tcPr>
           <w:p>
             <w:pPr>
-              <w:spacing w:before="0" w:beforeAutospacing="off" w:after="0" w:afterAutospacing="off"/>
+              <w:pStyle w:val="Normal"/>
+              <w:bidi w:val="0"/>
+              <w:jc w:val="center"/>
+            </w:pPr>
+            <w:r>
+              <w:rPr>
+                <w:rFonts w:ascii="Calibri" w:hAnsi="Calibri" w:eastAsia="Calibri" w:cs="Calibri"/>
+                <w:b w:val="0"/>
+                <w:bCs w:val="0"/>
+                <w:i w:val="0"/>
+                <w:iCs w:val="0"/>
+                <w:noProof w:val="0"/>
+                <w:color w:val="000000" w:themeColor="text1" w:themeTint="FF" w:themeShade="FF"/>
+                <w:sz w:val="16"/>
+                <w:szCs w:val="16"/>
+                <w:lang w:val="en-US"/>
+              </w:rPr>
+              <w:t>100 min</w:t>
+            </w:r>
+          </w:p>
+        </w:tc>
+      </w:tr>
+      <w:tr>
+        <w:trPr>
+          <w:trHeight w:val="150"/>
+        </w:trPr>
+        <w:tc>
+          <w:tcPr>
+            <w:tcW w:w="1530" w:type="dxa"/>
+            <w:tcBorders>
+              <w:top w:val="single" w:color="000000" w:themeColor="text1" w:sz="6"/>
+              <w:left w:val="single" w:color="000000" w:themeColor="text1" w:sz="6"/>
+              <w:bottom w:val="single" w:color="000000" w:themeColor="text1" w:sz="6"/>
+              <w:right w:val="single" w:color="000000" w:themeColor="text1" w:sz="6"/>
+            </w:tcBorders>
+            <w:tcMar>
+              <w:top w:w="60" w:type="dxa"/>
+              <w:left w:w="60" w:type="dxa"/>
+              <w:bottom w:w="60" w:type="dxa"/>
+              <w:right w:w="60" w:type="dxa"/>
+            </w:tcMar>
+            <w:vAlign w:val="top"/>
+          </w:tcPr>
+          <w:p>
+            <w:pPr>
+              <w:pStyle w:val="Normal"/>
+              <w:bidi w:val="0"/>
+              <w:jc w:val="center"/>
+              <w:rPr>
+                <w:rFonts w:ascii="Calibri" w:hAnsi="Calibri" w:eastAsia="Calibri" w:cs="Calibri"/>
+                <w:b w:val="0"/>
+                <w:bCs w:val="0"/>
+                <w:i w:val="0"/>
+                <w:iCs w:val="0"/>
+                <w:noProof w:val="0"/>
+                <w:color w:val="000000" w:themeColor="text1" w:themeTint="FF" w:themeShade="FF"/>
+                <w:sz w:val="16"/>
+                <w:szCs w:val="16"/>
+                <w:lang w:val="en-US"/>
+              </w:rPr>
+            </w:pPr>
+          </w:p>
+        </w:tc>
+        <w:tc>
+          <w:tcPr>
+            <w:tcW w:w="1500" w:type="dxa"/>
+            <w:tcBorders>
+              <w:top w:val="single" w:color="000000" w:themeColor="text1" w:sz="6"/>
+              <w:left w:val="single" w:color="000000" w:themeColor="text1" w:sz="6"/>
+              <w:bottom w:val="single" w:color="000000" w:themeColor="text1" w:sz="6"/>
+              <w:right w:val="single" w:color="000000" w:themeColor="text1" w:sz="6"/>
+            </w:tcBorders>
+            <w:tcMar>
+              <w:top w:w="60" w:type="dxa"/>
+              <w:left w:w="60" w:type="dxa"/>
+              <w:bottom w:w="60" w:type="dxa"/>
+              <w:right w:w="60" w:type="dxa"/>
+            </w:tcMar>
+            <w:vAlign w:val="top"/>
+          </w:tcPr>
+          <w:p>
+            <w:pPr>
+              <w:pStyle w:val="Normal"/>
+              <w:suppressLineNumbers w:val="0"/>
+              <w:bidi w:val="0"/>
+              <w:spacing w:before="0" w:beforeAutospacing="off" w:after="150" w:afterAutospacing="off" w:line="279" w:lineRule="auto"/>
+              <w:ind w:left="0" w:right="0"/>
+              <w:jc w:val="center"/>
+              <w:rPr>
+                <w:rFonts w:ascii="Helvetica" w:hAnsi="Helvetica" w:eastAsia="Helvetica" w:cs="Helvetica"/>
+                <w:b w:val="0"/>
+                <w:bCs w:val="0"/>
+                <w:i w:val="0"/>
+                <w:iCs w:val="0"/>
+                <w:color w:val="000000" w:themeColor="text1" w:themeTint="FF" w:themeShade="FF"/>
+                <w:sz w:val="16"/>
+                <w:szCs w:val="16"/>
+              </w:rPr>
+            </w:pPr>
+            <w:r>
+              <w:rPr>
+                <w:rFonts w:ascii="Helvetica" w:hAnsi="Helvetica" w:eastAsia="Helvetica" w:cs="Helvetica"/>
+                <w:b w:val="0"/>
+                <w:bCs w:val="0"/>
+                <w:i w:val="0"/>
+                <w:iCs w:val="0"/>
+                <w:color w:val="000000" w:themeColor="text1" w:themeTint="FF" w:themeShade="FF"/>
+                <w:sz w:val="16"/>
+                <w:szCs w:val="16"/>
+              </w:rPr>
+              <w:t>Uploading doc to github</w:t>
+            </w:r>
+          </w:p>
+        </w:tc>
+        <w:tc>
+          <w:tcPr>
+            <w:tcW w:w="1155" w:type="dxa"/>
+            <w:tcBorders>
+              <w:top w:val="single" w:color="000000" w:themeColor="text1" w:sz="6"/>
+              <w:left w:val="single" w:color="000000" w:themeColor="text1" w:sz="6"/>
+              <w:bottom w:val="single" w:color="000000" w:themeColor="text1" w:sz="6"/>
+              <w:right w:val="single" w:color="000000" w:themeColor="text1" w:sz="6"/>
+            </w:tcBorders>
+            <w:tcMar>
+              <w:top w:w="60" w:type="dxa"/>
+              <w:left w:w="60" w:type="dxa"/>
+              <w:bottom w:w="60" w:type="dxa"/>
+              <w:right w:w="60" w:type="dxa"/>
+            </w:tcMar>
+            <w:vAlign w:val="top"/>
+          </w:tcPr>
+          <w:p>
+            <w:pPr>
+              <w:pStyle w:val="Normal"/>
+              <w:suppressLineNumbers w:val="0"/>
+              <w:bidi w:val="0"/>
+              <w:spacing w:before="0" w:beforeAutospacing="off" w:after="150" w:afterAutospacing="off" w:line="279" w:lineRule="auto"/>
+              <w:ind w:left="0" w:right="0"/>
+              <w:jc w:val="center"/>
+              <w:rPr>
+                <w:rFonts w:ascii="Helvetica" w:hAnsi="Helvetica" w:eastAsia="Helvetica" w:cs="Helvetica"/>
+                <w:b w:val="0"/>
+                <w:bCs w:val="0"/>
+                <w:i w:val="0"/>
+                <w:iCs w:val="0"/>
+                <w:color w:val="000000" w:themeColor="text1" w:themeTint="FF" w:themeShade="FF"/>
+                <w:sz w:val="16"/>
+                <w:szCs w:val="16"/>
+              </w:rPr>
+            </w:pPr>
+            <w:r>
+              <w:rPr>
+                <w:rFonts w:ascii="Helvetica" w:hAnsi="Helvetica" w:eastAsia="Helvetica" w:cs="Helvetica"/>
+                <w:b w:val="0"/>
+                <w:bCs w:val="0"/>
+                <w:i w:val="0"/>
+                <w:iCs w:val="0"/>
+                <w:color w:val="000000" w:themeColor="text1" w:themeTint="FF" w:themeShade="FF"/>
+                <w:sz w:val="16"/>
+                <w:szCs w:val="16"/>
+              </w:rPr>
+              <w:t>10</w:t>
+            </w:r>
+            <w:r>
+              <w:rPr>
+                <w:rFonts w:ascii="Helvetica" w:hAnsi="Helvetica" w:eastAsia="Helvetica" w:cs="Helvetica"/>
+                <w:b w:val="0"/>
+                <w:bCs w:val="0"/>
+                <w:i w:val="0"/>
+                <w:iCs w:val="0"/>
+                <w:color w:val="000000" w:themeColor="text1" w:themeTint="FF" w:themeShade="FF"/>
+                <w:sz w:val="16"/>
+                <w:szCs w:val="16"/>
+              </w:rPr>
+              <w:t>/</w:t>
+            </w:r>
+            <w:r>
+              <w:rPr>
+                <w:rFonts w:ascii="Helvetica" w:hAnsi="Helvetica" w:eastAsia="Helvetica" w:cs="Helvetica"/>
+                <w:b w:val="0"/>
+                <w:bCs w:val="0"/>
+                <w:i w:val="0"/>
+                <w:iCs w:val="0"/>
+                <w:color w:val="000000" w:themeColor="text1" w:themeTint="FF" w:themeShade="FF"/>
+                <w:sz w:val="16"/>
+                <w:szCs w:val="16"/>
+              </w:rPr>
+              <w:t>04</w:t>
+            </w:r>
+            <w:r>
+              <w:rPr>
+                <w:rFonts w:ascii="Helvetica" w:hAnsi="Helvetica" w:eastAsia="Helvetica" w:cs="Helvetica"/>
+                <w:b w:val="0"/>
+                <w:bCs w:val="0"/>
+                <w:i w:val="0"/>
+                <w:iCs w:val="0"/>
+                <w:color w:val="000000" w:themeColor="text1" w:themeTint="FF" w:themeShade="FF"/>
+                <w:sz w:val="16"/>
+                <w:szCs w:val="16"/>
+              </w:rPr>
+              <w:t>/26</w:t>
+            </w:r>
+          </w:p>
+        </w:tc>
+        <w:tc>
+          <w:tcPr>
+            <w:tcW w:w="1305" w:type="dxa"/>
+            <w:tcBorders>
+              <w:top w:val="single" w:color="000000" w:themeColor="text1" w:sz="6"/>
+              <w:left w:val="single" w:color="000000" w:themeColor="text1" w:sz="6"/>
+              <w:bottom w:val="single" w:color="000000" w:themeColor="text1" w:sz="6"/>
+              <w:right w:val="single" w:color="000000" w:themeColor="text1" w:sz="6"/>
+            </w:tcBorders>
+            <w:tcMar>
+              <w:top w:w="60" w:type="dxa"/>
+              <w:left w:w="60" w:type="dxa"/>
+              <w:bottom w:w="60" w:type="dxa"/>
+              <w:right w:w="60" w:type="dxa"/>
+            </w:tcMar>
+            <w:vAlign w:val="top"/>
+          </w:tcPr>
+          <w:p>
+            <w:pPr>
+              <w:pStyle w:val="Normal"/>
+              <w:suppressLineNumbers w:val="0"/>
+              <w:bidi w:val="0"/>
+              <w:spacing w:before="0" w:beforeAutospacing="off" w:after="150" w:afterAutospacing="off" w:line="279" w:lineRule="auto"/>
+              <w:ind w:left="0" w:right="0"/>
+              <w:jc w:val="center"/>
+              <w:rPr>
+                <w:rFonts w:ascii="Helvetica" w:hAnsi="Helvetica" w:eastAsia="Helvetica" w:cs="Helvetica"/>
+                <w:b w:val="0"/>
+                <w:bCs w:val="0"/>
+                <w:i w:val="0"/>
+                <w:iCs w:val="0"/>
+                <w:color w:val="000000" w:themeColor="text1" w:themeTint="FF" w:themeShade="FF"/>
+                <w:sz w:val="16"/>
+                <w:szCs w:val="16"/>
+              </w:rPr>
+            </w:pPr>
+            <w:r>
+              <w:rPr>
+                <w:rFonts w:ascii="Helvetica" w:hAnsi="Helvetica" w:eastAsia="Helvetica" w:cs="Helvetica"/>
+                <w:b w:val="0"/>
+                <w:bCs w:val="0"/>
+                <w:i w:val="0"/>
+                <w:iCs w:val="0"/>
+                <w:color w:val="000000" w:themeColor="text1" w:themeTint="FF" w:themeShade="FF"/>
+                <w:sz w:val="16"/>
+                <w:szCs w:val="16"/>
+              </w:rPr>
+              <w:t>6</w:t>
+            </w:r>
+            <w:r>
+              <w:rPr>
+                <w:rFonts w:ascii="Helvetica" w:hAnsi="Helvetica" w:eastAsia="Helvetica" w:cs="Helvetica"/>
+                <w:b w:val="0"/>
+                <w:bCs w:val="0"/>
+                <w:i w:val="0"/>
+                <w:iCs w:val="0"/>
+                <w:color w:val="000000" w:themeColor="text1" w:themeTint="FF" w:themeShade="FF"/>
+                <w:sz w:val="16"/>
+                <w:szCs w:val="16"/>
+              </w:rPr>
+              <w:t>:00 pm</w:t>
+            </w:r>
+          </w:p>
+        </w:tc>
+        <w:tc>
+          <w:tcPr>
+            <w:tcW w:w="1380" w:type="dxa"/>
+            <w:tcBorders>
+              <w:top w:val="single" w:color="000000" w:themeColor="text1" w:sz="6"/>
+              <w:left w:val="single" w:color="000000" w:themeColor="text1" w:sz="6"/>
+              <w:bottom w:val="single" w:color="000000" w:themeColor="text1" w:sz="6"/>
+              <w:right w:val="single" w:color="000000" w:themeColor="text1" w:sz="6"/>
+            </w:tcBorders>
+            <w:tcMar>
+              <w:top w:w="60" w:type="dxa"/>
+              <w:left w:w="60" w:type="dxa"/>
+              <w:bottom w:w="60" w:type="dxa"/>
+              <w:right w:w="60" w:type="dxa"/>
+            </w:tcMar>
+            <w:vAlign w:val="top"/>
+          </w:tcPr>
+          <w:p>
+            <w:pPr>
+              <w:pStyle w:val="Normal"/>
+              <w:suppressLineNumbers w:val="0"/>
+              <w:bidi w:val="0"/>
+              <w:spacing w:before="0" w:beforeAutospacing="off" w:after="150" w:afterAutospacing="off" w:line="279" w:lineRule="auto"/>
+              <w:ind w:left="0" w:right="0"/>
+              <w:jc w:val="center"/>
+              <w:rPr>
+                <w:rFonts w:ascii="Helvetica" w:hAnsi="Helvetica" w:eastAsia="Helvetica" w:cs="Helvetica"/>
+                <w:b w:val="0"/>
+                <w:bCs w:val="0"/>
+                <w:i w:val="0"/>
+                <w:iCs w:val="0"/>
+                <w:color w:val="000000" w:themeColor="text1" w:themeTint="FF" w:themeShade="FF"/>
+                <w:sz w:val="16"/>
+                <w:szCs w:val="16"/>
+              </w:rPr>
+            </w:pPr>
+            <w:r>
+              <w:rPr>
+                <w:rFonts w:ascii="Helvetica" w:hAnsi="Helvetica" w:eastAsia="Helvetica" w:cs="Helvetica"/>
+                <w:b w:val="0"/>
+                <w:bCs w:val="0"/>
+                <w:i w:val="0"/>
+                <w:iCs w:val="0"/>
+                <w:color w:val="000000" w:themeColor="text1" w:themeTint="FF" w:themeShade="FF"/>
+                <w:sz w:val="16"/>
+                <w:szCs w:val="16"/>
+              </w:rPr>
+              <w:t>6</w:t>
+            </w:r>
+            <w:r>
+              <w:rPr>
+                <w:rFonts w:ascii="Helvetica" w:hAnsi="Helvetica" w:eastAsia="Helvetica" w:cs="Helvetica"/>
+                <w:b w:val="0"/>
+                <w:bCs w:val="0"/>
+                <w:i w:val="0"/>
+                <w:iCs w:val="0"/>
+                <w:color w:val="000000" w:themeColor="text1" w:themeTint="FF" w:themeShade="FF"/>
+                <w:sz w:val="16"/>
+                <w:szCs w:val="16"/>
+              </w:rPr>
+              <w:t>:10</w:t>
+            </w:r>
+            <w:r>
+              <w:rPr>
+                <w:rFonts w:ascii="Helvetica" w:hAnsi="Helvetica" w:eastAsia="Helvetica" w:cs="Helvetica"/>
+                <w:b w:val="0"/>
+                <w:bCs w:val="0"/>
+                <w:i w:val="0"/>
+                <w:iCs w:val="0"/>
+                <w:color w:val="000000" w:themeColor="text1" w:themeTint="FF" w:themeShade="FF"/>
+                <w:sz w:val="16"/>
+                <w:szCs w:val="16"/>
+              </w:rPr>
+              <w:t xml:space="preserve"> </w:t>
+            </w:r>
+            <w:r>
+              <w:rPr>
+                <w:rFonts w:ascii="Helvetica" w:hAnsi="Helvetica" w:eastAsia="Helvetica" w:cs="Helvetica"/>
+                <w:b w:val="0"/>
+                <w:bCs w:val="0"/>
+                <w:i w:val="0"/>
+                <w:iCs w:val="0"/>
+                <w:color w:val="000000" w:themeColor="text1" w:themeTint="FF" w:themeShade="FF"/>
+                <w:sz w:val="16"/>
+                <w:szCs w:val="16"/>
+              </w:rPr>
+              <w:t>pm</w:t>
+            </w:r>
+          </w:p>
+        </w:tc>
+        <w:tc>
+          <w:tcPr>
+            <w:tcW w:w="1305" w:type="dxa"/>
+            <w:tcBorders>
+              <w:top w:val="single" w:color="000000" w:themeColor="text1" w:sz="6"/>
+              <w:left w:val="single" w:color="000000" w:themeColor="text1" w:sz="6"/>
+              <w:bottom w:val="single" w:color="000000" w:themeColor="text1" w:sz="6"/>
+              <w:right w:val="single" w:color="000000" w:themeColor="text1" w:sz="6"/>
+            </w:tcBorders>
+            <w:tcMar>
+              <w:top w:w="60" w:type="dxa"/>
+              <w:left w:w="60" w:type="dxa"/>
+              <w:bottom w:w="60" w:type="dxa"/>
+              <w:right w:w="60" w:type="dxa"/>
+            </w:tcMar>
+            <w:vAlign w:val="top"/>
+          </w:tcPr>
+          <w:p>
+            <w:pPr>
+              <w:pStyle w:val="Normal"/>
+              <w:suppressLineNumbers w:val="0"/>
+              <w:bidi w:val="0"/>
+              <w:spacing w:before="0" w:beforeAutospacing="off" w:after="150" w:afterAutospacing="off" w:line="279" w:lineRule="auto"/>
+              <w:ind w:left="0" w:right="0"/>
+              <w:jc w:val="center"/>
+              <w:rPr>
+                <w:rFonts w:ascii="Helvetica" w:hAnsi="Helvetica" w:eastAsia="Helvetica" w:cs="Helvetica"/>
+                <w:b w:val="0"/>
+                <w:bCs w:val="0"/>
+                <w:i w:val="0"/>
+                <w:iCs w:val="0"/>
+                <w:color w:val="000000" w:themeColor="text1" w:themeTint="FF" w:themeShade="FF"/>
+                <w:sz w:val="16"/>
+                <w:szCs w:val="16"/>
+              </w:rPr>
+            </w:pPr>
+            <w:r>
+              <w:rPr>
+                <w:rFonts w:ascii="Helvetica" w:hAnsi="Helvetica" w:eastAsia="Helvetica" w:cs="Helvetica"/>
+                <w:b w:val="0"/>
+                <w:bCs w:val="0"/>
+                <w:i w:val="0"/>
+                <w:iCs w:val="0"/>
+                <w:color w:val="000000" w:themeColor="text1" w:themeTint="FF" w:themeShade="FF"/>
+                <w:sz w:val="16"/>
+                <w:szCs w:val="16"/>
+              </w:rPr>
+              <w:t>10 min</w:t>
+            </w:r>
+          </w:p>
+        </w:tc>
+      </w:tr>
+      <w:tr>
+        <w:trPr>
+          <w:trHeight w:val="150"/>
+        </w:trPr>
+        <w:tc>
+          <w:tcPr>
+            <w:tcW w:w="1530" w:type="dxa"/>
+            <w:tcBorders>
+              <w:top w:val="single" w:color="000000" w:themeColor="text1" w:sz="6"/>
+              <w:left w:val="single" w:color="000000" w:themeColor="text1" w:sz="6"/>
+              <w:bottom w:val="single" w:color="000000" w:themeColor="text1" w:sz="6"/>
+              <w:right w:val="single" w:color="000000" w:themeColor="text1" w:sz="6"/>
+            </w:tcBorders>
+            <w:tcMar>
+              <w:top w:w="60" w:type="dxa"/>
+              <w:left w:w="60" w:type="dxa"/>
+              <w:bottom w:w="60" w:type="dxa"/>
+              <w:right w:w="60" w:type="dxa"/>
+            </w:tcMar>
+            <w:vAlign w:val="top"/>
+          </w:tcPr>
+          <w:p>
+            <w:pPr>
+              <w:pStyle w:val="Normal"/>
+              <w:bidi w:val="0"/>
+              <w:spacing w:line="279" w:lineRule="auto"/>
+              <w:jc w:val="center"/>
+              <w:rPr>
+                <w:rFonts w:ascii="Helvetica" w:hAnsi="Helvetica" w:eastAsia="Helvetica" w:cs="Helvetica"/>
+                <w:b w:val="0"/>
+                <w:bCs w:val="0"/>
+                <w:i w:val="0"/>
+                <w:iCs w:val="0"/>
+                <w:color w:val="000000" w:themeColor="text1" w:themeTint="FF" w:themeShade="FF"/>
+                <w:sz w:val="16"/>
+                <w:szCs w:val="16"/>
+              </w:rPr>
+            </w:pPr>
+          </w:p>
+        </w:tc>
+        <w:tc>
+          <w:tcPr>
+            <w:tcW w:w="1500" w:type="dxa"/>
+            <w:tcBorders>
+              <w:top w:val="single" w:color="000000" w:themeColor="text1" w:sz="6"/>
+              <w:left w:val="single" w:color="000000" w:themeColor="text1" w:sz="6"/>
+              <w:bottom w:val="single" w:color="000000" w:themeColor="text1" w:sz="6"/>
+              <w:right w:val="single" w:color="000000" w:themeColor="text1" w:sz="6"/>
+            </w:tcBorders>
+            <w:tcMar>
+              <w:top w:w="60" w:type="dxa"/>
+              <w:left w:w="60" w:type="dxa"/>
+              <w:bottom w:w="60" w:type="dxa"/>
+              <w:right w:w="60" w:type="dxa"/>
+            </w:tcMar>
+            <w:vAlign w:val="top"/>
+          </w:tcPr>
+          <w:p>
+            <w:pPr>
+              <w:pStyle w:val="Normal"/>
+              <w:bidi w:val="0"/>
+              <w:spacing w:line="279" w:lineRule="auto"/>
+              <w:jc w:val="center"/>
+              <w:rPr>
+                <w:rFonts w:ascii="Helvetica" w:hAnsi="Helvetica" w:eastAsia="Helvetica" w:cs="Helvetica"/>
+                <w:b w:val="0"/>
+                <w:bCs w:val="0"/>
+                <w:i w:val="0"/>
+                <w:iCs w:val="0"/>
+                <w:color w:val="000000" w:themeColor="text1" w:themeTint="FF" w:themeShade="FF"/>
+                <w:sz w:val="16"/>
+                <w:szCs w:val="16"/>
+              </w:rPr>
+            </w:pPr>
+          </w:p>
+        </w:tc>
+        <w:tc>
+          <w:tcPr>
+            <w:tcW w:w="1155" w:type="dxa"/>
+            <w:tcBorders>
+              <w:top w:val="single" w:color="000000" w:themeColor="text1" w:sz="6"/>
+              <w:left w:val="single" w:color="000000" w:themeColor="text1" w:sz="6"/>
+              <w:bottom w:val="single" w:color="000000" w:themeColor="text1" w:sz="6"/>
+              <w:right w:val="single" w:color="000000" w:themeColor="text1" w:sz="6"/>
+            </w:tcBorders>
+            <w:tcMar>
+              <w:top w:w="60" w:type="dxa"/>
+              <w:left w:w="60" w:type="dxa"/>
+              <w:bottom w:w="60" w:type="dxa"/>
+              <w:right w:w="60" w:type="dxa"/>
+            </w:tcMar>
+            <w:vAlign w:val="top"/>
+          </w:tcPr>
+          <w:p>
+            <w:pPr>
+              <w:pStyle w:val="Normal"/>
+              <w:bidi w:val="0"/>
+              <w:spacing w:line="279" w:lineRule="auto"/>
+              <w:jc w:val="center"/>
+              <w:rPr>
+                <w:rFonts w:ascii="Helvetica" w:hAnsi="Helvetica" w:eastAsia="Helvetica" w:cs="Helvetica"/>
+                <w:b w:val="0"/>
+                <w:bCs w:val="0"/>
+                <w:i w:val="0"/>
+                <w:iCs w:val="0"/>
+                <w:color w:val="000000" w:themeColor="text1" w:themeTint="FF" w:themeShade="FF"/>
+                <w:sz w:val="16"/>
+                <w:szCs w:val="16"/>
+              </w:rPr>
+            </w:pPr>
+          </w:p>
+        </w:tc>
+        <w:tc>
+          <w:tcPr>
+            <w:tcW w:w="1305" w:type="dxa"/>
+            <w:tcBorders>
+              <w:top w:val="single" w:color="000000" w:themeColor="text1" w:sz="6"/>
+              <w:left w:val="single" w:color="000000" w:themeColor="text1" w:sz="6"/>
+              <w:bottom w:val="single" w:color="000000" w:themeColor="text1" w:sz="6"/>
+              <w:right w:val="single" w:color="000000" w:themeColor="text1" w:sz="6"/>
+            </w:tcBorders>
+            <w:tcMar>
+              <w:top w:w="60" w:type="dxa"/>
+              <w:left w:w="60" w:type="dxa"/>
+              <w:bottom w:w="60" w:type="dxa"/>
+              <w:right w:w="60" w:type="dxa"/>
+            </w:tcMar>
+            <w:vAlign w:val="top"/>
+          </w:tcPr>
+          <w:p>
+            <w:pPr>
+              <w:pStyle w:val="Normal"/>
+              <w:bidi w:val="0"/>
+              <w:spacing w:line="279" w:lineRule="auto"/>
+              <w:jc w:val="center"/>
+              <w:rPr>
+                <w:rFonts w:ascii="Helvetica" w:hAnsi="Helvetica" w:eastAsia="Helvetica" w:cs="Helvetica"/>
+                <w:b w:val="0"/>
+                <w:bCs w:val="0"/>
+                <w:i w:val="0"/>
+                <w:iCs w:val="0"/>
+                <w:color w:val="000000" w:themeColor="text1" w:themeTint="FF" w:themeShade="FF"/>
+                <w:sz w:val="16"/>
+                <w:szCs w:val="16"/>
+              </w:rPr>
+            </w:pPr>
+          </w:p>
+        </w:tc>
+        <w:tc>
+          <w:tcPr>
+            <w:tcW w:w="1380" w:type="dxa"/>
+            <w:tcBorders>
+              <w:top w:val="single" w:color="000000" w:themeColor="text1" w:sz="6"/>
+              <w:left w:val="single" w:color="000000" w:themeColor="text1" w:sz="6"/>
+              <w:bottom w:val="single" w:color="000000" w:themeColor="text1" w:sz="6"/>
+              <w:right w:val="single" w:color="000000" w:themeColor="text1" w:sz="6"/>
+            </w:tcBorders>
+            <w:tcMar>
+              <w:top w:w="60" w:type="dxa"/>
+              <w:left w:w="60" w:type="dxa"/>
+              <w:bottom w:w="60" w:type="dxa"/>
+              <w:right w:w="60" w:type="dxa"/>
+            </w:tcMar>
+            <w:vAlign w:val="top"/>
+          </w:tcPr>
+          <w:p>
+            <w:pPr>
+              <w:pStyle w:val="Normal"/>
+              <w:bidi w:val="0"/>
+              <w:spacing w:line="279" w:lineRule="auto"/>
+              <w:jc w:val="center"/>
+              <w:rPr>
+                <w:rFonts w:ascii="Helvetica" w:hAnsi="Helvetica" w:eastAsia="Helvetica" w:cs="Helvetica"/>
+                <w:b w:val="0"/>
+                <w:bCs w:val="0"/>
+                <w:i w:val="0"/>
+                <w:iCs w:val="0"/>
+                <w:color w:val="000000" w:themeColor="text1" w:themeTint="FF" w:themeShade="FF"/>
+                <w:sz w:val="16"/>
+                <w:szCs w:val="16"/>
+              </w:rPr>
+            </w:pPr>
+          </w:p>
+        </w:tc>
+        <w:tc>
+          <w:tcPr>
+            <w:tcW w:w="1305" w:type="dxa"/>
+            <w:tcBorders>
+              <w:top w:val="single" w:color="000000" w:themeColor="text1" w:sz="6"/>
+              <w:left w:val="single" w:color="000000" w:themeColor="text1" w:sz="6"/>
+              <w:bottom w:val="single" w:color="000000" w:themeColor="text1" w:sz="6"/>
+              <w:right w:val="single" w:color="000000" w:themeColor="text1" w:sz="6"/>
+            </w:tcBorders>
+            <w:tcMar>
+              <w:top w:w="60" w:type="dxa"/>
+              <w:left w:w="60" w:type="dxa"/>
+              <w:bottom w:w="60" w:type="dxa"/>
+              <w:right w:w="60" w:type="dxa"/>
+            </w:tcMar>
+            <w:vAlign w:val="top"/>
+          </w:tcPr>
+          <w:p>
+            <w:pPr>
+              <w:pStyle w:val="Normal"/>
+              <w:suppressLineNumbers w:val="0"/>
+              <w:bidi w:val="0"/>
+              <w:spacing w:before="0" w:beforeAutospacing="off" w:after="150" w:afterAutospacing="off" w:line="279" w:lineRule="auto"/>
+              <w:ind w:left="0" w:right="0"/>
+              <w:jc w:val="center"/>
+              <w:rPr>
+                <w:rFonts w:ascii="Helvetica" w:hAnsi="Helvetica" w:eastAsia="Helvetica" w:cs="Helvetica"/>
+                <w:b w:val="0"/>
+                <w:bCs w:val="0"/>
+                <w:i w:val="0"/>
+                <w:iCs w:val="0"/>
+                <w:color w:val="000000" w:themeColor="text1" w:themeTint="FF" w:themeShade="FF"/>
+                <w:sz w:val="16"/>
+                <w:szCs w:val="16"/>
+              </w:rPr>
+            </w:pPr>
+            <w:r>
+              <w:rPr>
+                <w:rFonts w:ascii="Helvetica" w:hAnsi="Helvetica" w:eastAsia="Helvetica" w:cs="Helvetica"/>
+                <w:b w:val="0"/>
+                <w:bCs w:val="0"/>
+                <w:i w:val="0"/>
+                <w:iCs w:val="0"/>
+                <w:color w:val="000000" w:themeColor="text1" w:themeTint="FF" w:themeShade="FF"/>
+                <w:sz w:val="16"/>
+                <w:szCs w:val="16"/>
+              </w:rPr>
+              <w:t>Week</w:t>
+            </w:r>
+            <w:r>
+              <w:rPr>
+                <w:rFonts w:ascii="Helvetica" w:hAnsi="Helvetica" w:eastAsia="Helvetica" w:cs="Helvetica"/>
+                <w:b w:val="0"/>
+                <w:bCs w:val="0"/>
+                <w:i w:val="0"/>
+                <w:iCs w:val="0"/>
+                <w:color w:val="000000" w:themeColor="text1" w:themeTint="FF" w:themeShade="FF"/>
+                <w:sz w:val="16"/>
+                <w:szCs w:val="16"/>
+              </w:rPr>
+              <w:t xml:space="preserve"> 3</w:t>
+            </w:r>
+            <w:r>
+              <w:rPr>
+                <w:rFonts w:ascii="Helvetica" w:hAnsi="Helvetica" w:eastAsia="Helvetica" w:cs="Helvetica"/>
+                <w:b w:val="0"/>
+                <w:bCs w:val="0"/>
+                <w:i w:val="0"/>
+                <w:iCs w:val="0"/>
+                <w:color w:val="000000" w:themeColor="text1" w:themeTint="FF" w:themeShade="FF"/>
+                <w:sz w:val="16"/>
+                <w:szCs w:val="16"/>
+              </w:rPr>
+              <w:t xml:space="preserve"> total: </w:t>
+            </w:r>
+          </w:p>
+          <w:p>
+            <w:pPr>
+              <w:pStyle w:val="Normal"/>
+              <w:suppressLineNumbers w:val="0"/>
+              <w:bidi w:val="0"/>
+              <w:spacing w:before="0" w:beforeAutospacing="off" w:after="150" w:afterAutospacing="off" w:line="279" w:lineRule="auto"/>
+              <w:ind w:left="0" w:right="0"/>
+              <w:jc w:val="center"/>
+              <w:rPr>
+                <w:rFonts w:ascii="Helvetica" w:hAnsi="Helvetica" w:eastAsia="Helvetica" w:cs="Helvetica"/>
+                <w:b w:val="0"/>
+                <w:bCs w:val="0"/>
+                <w:i w:val="0"/>
+                <w:iCs w:val="0"/>
+                <w:color w:val="000000" w:themeColor="text1" w:themeTint="FF" w:themeShade="FF"/>
+                <w:sz w:val="16"/>
+                <w:szCs w:val="16"/>
+              </w:rPr>
+            </w:pPr>
+            <w:r>
+              <w:rPr>
+                <w:rFonts w:ascii="Helvetica" w:hAnsi="Helvetica" w:eastAsia="Helvetica" w:cs="Helvetica"/>
+                <w:b w:val="0"/>
+                <w:bCs w:val="0"/>
+                <w:i w:val="0"/>
+                <w:iCs w:val="0"/>
+                <w:color w:val="000000" w:themeColor="text1" w:themeTint="FF" w:themeShade="FF"/>
+                <w:sz w:val="16"/>
+                <w:szCs w:val="16"/>
+              </w:rPr>
+              <w:t>1</w:t>
+            </w:r>
+            <w:r>
+              <w:rPr>
+                <w:rFonts w:ascii="Helvetica" w:hAnsi="Helvetica" w:eastAsia="Helvetica" w:cs="Helvetica"/>
+                <w:b w:val="0"/>
+                <w:bCs w:val="0"/>
+                <w:i w:val="0"/>
+                <w:iCs w:val="0"/>
+                <w:color w:val="000000" w:themeColor="text1" w:themeTint="FF" w:themeShade="FF"/>
+                <w:sz w:val="16"/>
+                <w:szCs w:val="16"/>
+              </w:rPr>
+              <w:t>4</w:t>
+            </w:r>
+            <w:r>
+              <w:rPr>
+                <w:rFonts w:ascii="Helvetica" w:hAnsi="Helvetica" w:eastAsia="Helvetica" w:cs="Helvetica"/>
+                <w:b w:val="0"/>
+                <w:bCs w:val="0"/>
+                <w:i w:val="0"/>
+                <w:iCs w:val="0"/>
+                <w:color w:val="000000" w:themeColor="text1" w:themeTint="FF" w:themeShade="FF"/>
+                <w:sz w:val="16"/>
+                <w:szCs w:val="16"/>
+              </w:rPr>
+              <w:t>0 min</w:t>
+            </w:r>
+          </w:p>
+          <w:p>
+            <w:pPr>
+              <w:pStyle w:val="Normal"/>
+              <w:bidi w:val="0"/>
+              <w:spacing w:line="279" w:lineRule="auto"/>
+              <w:jc w:val="center"/>
+              <w:rPr>
+                <w:rFonts w:ascii="Helvetica" w:hAnsi="Helvetica" w:eastAsia="Helvetica" w:cs="Helvetica"/>
+                <w:b w:val="0"/>
+                <w:bCs w:val="0"/>
+                <w:i w:val="0"/>
+                <w:iCs w:val="0"/>
+                <w:color w:val="000000" w:themeColor="text1" w:themeTint="FF" w:themeShade="FF"/>
+                <w:sz w:val="16"/>
+                <w:szCs w:val="16"/>
+              </w:rPr>
             </w:pPr>
           </w:p>
         </w:tc>
       </w:tr>
     </w:tbl>
-    <w:p xmlns:wp14="http://schemas.microsoft.com/office/word/2010/wordml" wp14:paraId="2C078E63" wp14:textId="52C2B363"/>
+    <w:p xmlns:wp14="http://schemas.microsoft.com/office/word/2010/wordml" wp14:paraId="2C078E63" wp14:textId="2C0BA3E0"/>
     <w:sectPr>
       <w:pgSz w:w="12240" w:h="15840" w:orient="portrait"/>
       <w:pgMar w:top="1440" w:right="1440" w:bottom="1440" w:left="1440" w:header="720" w:footer="720" w:gutter="0"/>

</xml_diff>